<commit_message>
more token space for judge gemini
</commit_message>
<xml_diff>
--- a/Documentazione/Piano di riconciliazione.docx
+++ b/Documentazione/Piano di riconciliazione.docx
@@ -799,9 +799,22 @@
           <w:lang w:eastAsia="it-IT"/>
           <w14:ligatures w14:val="none"/>
         </w:rPr>
-        <w:t>raci_matrix.Documents</w:t>
-      </w:r>
-      <w:proofErr w:type="spellEnd"/>
+        <w:t>raci_</w:t>
+      </w:r>
+      <w:proofErr w:type="gramStart"/>
+      <w:r>
+        <w:rPr>
+          <w:rFonts w:ascii="Courier New" w:eastAsia="Times New Roman" w:hAnsi="Courier New" w:cs="Courier New"/>
+          <w:kern w:val="0"/>
+          <w:sz w:val="20"/>
+          <w:szCs w:val="20"/>
+          <w:lang w:eastAsia="it-IT"/>
+          <w14:ligatures w14:val="none"/>
+        </w:rPr>
+        <w:t>matrix.Documents</w:t>
+      </w:r>
+      <w:proofErr w:type="spellEnd"/>
+      <w:proofErr w:type="gramEnd"/>
     </w:p>
     <w:p>
       <w:pPr>
@@ -1229,7 +1242,31 @@
           <w14:ligatures w14:val="none"/>
         </w:rPr>
         <w:lastRenderedPageBreak/>
-        <w:t>historical_mdr_normalization.v_MdrPreviousRecords_Normalized_All</w:t>
+        <w:t>historical_mdr_</w:t>
+      </w:r>
+      <w:proofErr w:type="gramStart"/>
+      <w:r>
+        <w:rPr>
+          <w:rFonts w:ascii="Courier New" w:eastAsia="Times New Roman" w:hAnsi="Courier New" w:cs="Courier New"/>
+          <w:kern w:val="0"/>
+          <w:sz w:val="20"/>
+          <w:szCs w:val="20"/>
+          <w:lang w:val="en-US" w:eastAsia="it-IT"/>
+          <w14:ligatures w14:val="none"/>
+        </w:rPr>
+        <w:t>normalization.v</w:t>
+      </w:r>
+      <w:proofErr w:type="gramEnd"/>
+      <w:r>
+        <w:rPr>
+          <w:rFonts w:ascii="Courier New" w:eastAsia="Times New Roman" w:hAnsi="Courier New" w:cs="Courier New"/>
+          <w:kern w:val="0"/>
+          <w:sz w:val="20"/>
+          <w:szCs w:val="20"/>
+          <w:lang w:val="en-US" w:eastAsia="it-IT"/>
+          <w14:ligatures w14:val="none"/>
+        </w:rPr>
+        <w:t>_MdrPreviousRecords_Normalized_All</w:t>
       </w:r>
     </w:p>
     <w:p>
@@ -2841,9 +2878,22 @@
           <w:lang w:eastAsia="it-IT"/>
           <w14:ligatures w14:val="none"/>
         </w:rPr>
-        <w:t>my_db.mdr_reconciliation.MdrReconciliationResults</w:t>
-      </w:r>
-      <w:proofErr w:type="spellEnd"/>
+        <w:t>my_db.mdr_</w:t>
+      </w:r>
+      <w:proofErr w:type="gramStart"/>
+      <w:r>
+        <w:rPr>
+          <w:rFonts w:ascii="Times New Roman" w:eastAsia="Times New Roman" w:hAnsi="Times New Roman" w:cs="Times New Roman"/>
+          <w:kern w:val="0"/>
+          <w:sz w:val="24"/>
+          <w:szCs w:val="24"/>
+          <w:lang w:eastAsia="it-IT"/>
+          <w14:ligatures w14:val="none"/>
+        </w:rPr>
+        <w:t>reconciliation.MdrReconciliationResults</w:t>
+      </w:r>
+      <w:proofErr w:type="spellEnd"/>
+      <w:proofErr w:type="gramEnd"/>
     </w:p>
     <w:p>
       <w:pPr>
@@ -3157,9 +3207,22 @@
           <w:lang w:eastAsia="it-IT"/>
           <w14:ligatures w14:val="none"/>
         </w:rPr>
-        <w:t>my_db.mdr_reconciliation.MdrReconciliationAgentDecisions</w:t>
-      </w:r>
-      <w:proofErr w:type="spellEnd"/>
+        <w:t>my_db.mdr_</w:t>
+      </w:r>
+      <w:proofErr w:type="gramStart"/>
+      <w:r>
+        <w:rPr>
+          <w:rFonts w:ascii="Times New Roman" w:eastAsia="Times New Roman" w:hAnsi="Times New Roman" w:cs="Times New Roman"/>
+          <w:kern w:val="0"/>
+          <w:sz w:val="24"/>
+          <w:szCs w:val="24"/>
+          <w:lang w:eastAsia="it-IT"/>
+          <w14:ligatures w14:val="none"/>
+        </w:rPr>
+        <w:t>reconciliation.MdrReconciliationAgentDecisions</w:t>
+      </w:r>
+      <w:proofErr w:type="spellEnd"/>
+      <w:proofErr w:type="gramEnd"/>
     </w:p>
     <w:p>
       <w:pPr>
@@ -3218,9 +3281,22 @@
           <w:lang w:eastAsia="it-IT"/>
           <w14:ligatures w14:val="none"/>
         </w:rPr>
-        <w:t>my_db.mdr_reconciliation.MdrReconciliationAgentTopCandidates</w:t>
-      </w:r>
-      <w:proofErr w:type="spellEnd"/>
+        <w:t>my_db.mdr_</w:t>
+      </w:r>
+      <w:proofErr w:type="gramStart"/>
+      <w:r>
+        <w:rPr>
+          <w:rFonts w:ascii="Times New Roman" w:eastAsia="Times New Roman" w:hAnsi="Times New Roman" w:cs="Times New Roman"/>
+          <w:kern w:val="0"/>
+          <w:sz w:val="24"/>
+          <w:szCs w:val="24"/>
+          <w:lang w:eastAsia="it-IT"/>
+          <w14:ligatures w14:val="none"/>
+        </w:rPr>
+        <w:t>reconciliation.MdrReconciliationAgentTopCandidates</w:t>
+      </w:r>
+      <w:proofErr w:type="spellEnd"/>
+      <w:proofErr w:type="gramEnd"/>
     </w:p>
     <w:p>
       <w:pPr>
@@ -3508,9 +3584,22 @@
           <w:lang w:eastAsia="it-IT"/>
           <w14:ligatures w14:val="none"/>
         </w:rPr>
-        <w:t>my_db.mdr_reconciliation.MdrToRaciCandidates</w:t>
-      </w:r>
-      <w:proofErr w:type="spellEnd"/>
+        <w:t>my_db.mdr_</w:t>
+      </w:r>
+      <w:proofErr w:type="gramStart"/>
+      <w:r>
+        <w:rPr>
+          <w:rFonts w:ascii="Times New Roman" w:eastAsia="Times New Roman" w:hAnsi="Times New Roman" w:cs="Times New Roman"/>
+          <w:kern w:val="0"/>
+          <w:sz w:val="24"/>
+          <w:szCs w:val="24"/>
+          <w:lang w:eastAsia="it-IT"/>
+          <w14:ligatures w14:val="none"/>
+        </w:rPr>
+        <w:t>reconciliation.MdrToRaciCandidates</w:t>
+      </w:r>
+      <w:proofErr w:type="spellEnd"/>
+      <w:proofErr w:type="gramEnd"/>
     </w:p>
     <w:p>
       <w:pPr>
@@ -3647,16 +3736,29 @@
           <w14:ligatures w14:val="none"/>
         </w:rPr>
       </w:pPr>
-      <w:r>
-        <w:rPr>
-          <w:rFonts w:ascii="Times New Roman" w:eastAsia="Times New Roman" w:hAnsi="Times New Roman" w:cs="Times New Roman"/>
-          <w:kern w:val="0"/>
-          <w:sz w:val="24"/>
-          <w:szCs w:val="24"/>
-          <w:lang w:val="en-US" w:eastAsia="it-IT"/>
-          <w14:ligatures w14:val="none"/>
-        </w:rPr>
-        <w:t>Se:</w:t>
+      <w:proofErr w:type="gramStart"/>
+      <w:r>
+        <w:rPr>
+          <w:rFonts w:ascii="Times New Roman" w:eastAsia="Times New Roman" w:hAnsi="Times New Roman" w:cs="Times New Roman"/>
+          <w:kern w:val="0"/>
+          <w:sz w:val="24"/>
+          <w:szCs w:val="24"/>
+          <w:lang w:val="en-US" w:eastAsia="it-IT"/>
+          <w14:ligatures w14:val="none"/>
+        </w:rPr>
+        <w:t>Se</w:t>
+      </w:r>
+      <w:proofErr w:type="gramEnd"/>
+      <w:r>
+        <w:rPr>
+          <w:rFonts w:ascii="Times New Roman" w:eastAsia="Times New Roman" w:hAnsi="Times New Roman" w:cs="Times New Roman"/>
+          <w:kern w:val="0"/>
+          <w:sz w:val="24"/>
+          <w:szCs w:val="24"/>
+          <w:lang w:val="en-US" w:eastAsia="it-IT"/>
+          <w14:ligatures w14:val="none"/>
+        </w:rPr>
+        <w:t>:</w:t>
       </w:r>
     </w:p>
     <w:p>
@@ -4386,16 +4488,29 @@
           <w14:ligatures w14:val="none"/>
         </w:rPr>
       </w:pPr>
-      <w:r>
-        <w:rPr>
-          <w:rFonts w:ascii="Times New Roman" w:eastAsia="Times New Roman" w:hAnsi="Times New Roman" w:cs="Times New Roman"/>
-          <w:kern w:val="0"/>
-          <w:sz w:val="24"/>
-          <w:szCs w:val="24"/>
-          <w:lang w:val="en-US" w:eastAsia="it-IT"/>
-          <w14:ligatures w14:val="none"/>
-        </w:rPr>
-        <w:t>Se:</w:t>
+      <w:proofErr w:type="gramStart"/>
+      <w:r>
+        <w:rPr>
+          <w:rFonts w:ascii="Times New Roman" w:eastAsia="Times New Roman" w:hAnsi="Times New Roman" w:cs="Times New Roman"/>
+          <w:kern w:val="0"/>
+          <w:sz w:val="24"/>
+          <w:szCs w:val="24"/>
+          <w:lang w:val="en-US" w:eastAsia="it-IT"/>
+          <w14:ligatures w14:val="none"/>
+        </w:rPr>
+        <w:t>Se</w:t>
+      </w:r>
+      <w:proofErr w:type="gramEnd"/>
+      <w:r>
+        <w:rPr>
+          <w:rFonts w:ascii="Times New Roman" w:eastAsia="Times New Roman" w:hAnsi="Times New Roman" w:cs="Times New Roman"/>
+          <w:kern w:val="0"/>
+          <w:sz w:val="24"/>
+          <w:szCs w:val="24"/>
+          <w:lang w:val="en-US" w:eastAsia="it-IT"/>
+          <w14:ligatures w14:val="none"/>
+        </w:rPr>
+        <w:t>:</w:t>
       </w:r>
     </w:p>
     <w:p>
@@ -4977,16 +5092,29 @@
           <w14:ligatures w14:val="none"/>
         </w:rPr>
       </w:pPr>
-      <w:r>
-        <w:rPr>
-          <w:rFonts w:ascii="Times New Roman" w:eastAsia="Times New Roman" w:hAnsi="Times New Roman" w:cs="Times New Roman"/>
-          <w:kern w:val="0"/>
-          <w:sz w:val="24"/>
-          <w:szCs w:val="24"/>
-          <w:lang w:val="en-US" w:eastAsia="it-IT"/>
-          <w14:ligatures w14:val="none"/>
-        </w:rPr>
-        <w:t>Se:</w:t>
+      <w:proofErr w:type="gramStart"/>
+      <w:r>
+        <w:rPr>
+          <w:rFonts w:ascii="Times New Roman" w:eastAsia="Times New Roman" w:hAnsi="Times New Roman" w:cs="Times New Roman"/>
+          <w:kern w:val="0"/>
+          <w:sz w:val="24"/>
+          <w:szCs w:val="24"/>
+          <w:lang w:val="en-US" w:eastAsia="it-IT"/>
+          <w14:ligatures w14:val="none"/>
+        </w:rPr>
+        <w:t>Se</w:t>
+      </w:r>
+      <w:proofErr w:type="gramEnd"/>
+      <w:r>
+        <w:rPr>
+          <w:rFonts w:ascii="Times New Roman" w:eastAsia="Times New Roman" w:hAnsi="Times New Roman" w:cs="Times New Roman"/>
+          <w:kern w:val="0"/>
+          <w:sz w:val="24"/>
+          <w:szCs w:val="24"/>
+          <w:lang w:val="en-US" w:eastAsia="it-IT"/>
+          <w14:ligatures w14:val="none"/>
+        </w:rPr>
+        <w:t>:</w:t>
       </w:r>
     </w:p>
     <w:p>
@@ -5058,7 +5186,31 @@
           <w:lang w:eastAsia="it-IT"/>
           <w14:ligatures w14:val="none"/>
         </w:rPr>
-        <w:t>- X != Y</w:t>
+        <w:t xml:space="preserve">- </w:t>
+      </w:r>
+      <w:proofErr w:type="gramStart"/>
+      <w:r>
+        <w:rPr>
+          <w:rFonts w:ascii="Times New Roman" w:eastAsia="Times New Roman" w:hAnsi="Times New Roman" w:cs="Times New Roman"/>
+          <w:kern w:val="0"/>
+          <w:sz w:val="24"/>
+          <w:szCs w:val="24"/>
+          <w:lang w:eastAsia="it-IT"/>
+          <w14:ligatures w14:val="none"/>
+        </w:rPr>
+        <w:t>X !</w:t>
+      </w:r>
+      <w:proofErr w:type="gramEnd"/>
+      <w:r>
+        <w:rPr>
+          <w:rFonts w:ascii="Times New Roman" w:eastAsia="Times New Roman" w:hAnsi="Times New Roman" w:cs="Times New Roman"/>
+          <w:kern w:val="0"/>
+          <w:sz w:val="24"/>
+          <w:szCs w:val="24"/>
+          <w:lang w:eastAsia="it-IT"/>
+          <w14:ligatures w14:val="none"/>
+        </w:rPr>
+        <w:t>= Y</w:t>
       </w:r>
     </w:p>
     <w:p>
@@ -6312,7 +6464,31 @@
           <w:lang w:val="en-US" w:eastAsia="it-IT"/>
           <w14:ligatures w14:val="none"/>
         </w:rPr>
-        <w:t>judge_llm_match_no_match_conflict</w:t>
+        <w:t>judge_llm_match_</w:t>
+      </w:r>
+      <w:proofErr w:type="gramStart"/>
+      <w:r>
+        <w:rPr>
+          <w:rFonts w:ascii="Times New Roman" w:eastAsia="Times New Roman" w:hAnsi="Times New Roman" w:cs="Times New Roman"/>
+          <w:kern w:val="0"/>
+          <w:sz w:val="24"/>
+          <w:szCs w:val="24"/>
+          <w:lang w:val="en-US" w:eastAsia="it-IT"/>
+          <w14:ligatures w14:val="none"/>
+        </w:rPr>
+        <w:t>no</w:t>
+      </w:r>
+      <w:proofErr w:type="gramEnd"/>
+      <w:r>
+        <w:rPr>
+          <w:rFonts w:ascii="Times New Roman" w:eastAsia="Times New Roman" w:hAnsi="Times New Roman" w:cs="Times New Roman"/>
+          <w:kern w:val="0"/>
+          <w:sz w:val="24"/>
+          <w:szCs w:val="24"/>
+          <w:lang w:val="en-US" w:eastAsia="it-IT"/>
+          <w14:ligatures w14:val="none"/>
+        </w:rPr>
+        <w:t>_match_conflict</w:t>
       </w:r>
       <w:proofErr w:type="spellEnd"/>
       <w:r>
@@ -6580,9 +6756,22 @@
           <w:lang w:eastAsia="it-IT"/>
           <w14:ligatures w14:val="none"/>
         </w:rPr>
-        <w:t>my_db.mdr_reconciliation.MdrReconciliationAgentDecisions</w:t>
-      </w:r>
-      <w:proofErr w:type="spellEnd"/>
+        <w:t>my_db.mdr_</w:t>
+      </w:r>
+      <w:proofErr w:type="gramStart"/>
+      <w:r>
+        <w:rPr>
+          <w:rFonts w:ascii="Times New Roman" w:eastAsia="Times New Roman" w:hAnsi="Times New Roman" w:cs="Times New Roman"/>
+          <w:kern w:val="0"/>
+          <w:sz w:val="24"/>
+          <w:szCs w:val="24"/>
+          <w:lang w:eastAsia="it-IT"/>
+          <w14:ligatures w14:val="none"/>
+        </w:rPr>
+        <w:t>reconciliation.MdrReconciliationAgentDecisions</w:t>
+      </w:r>
+      <w:proofErr w:type="spellEnd"/>
+      <w:proofErr w:type="gramEnd"/>
     </w:p>
     <w:p>
       <w:pPr>
@@ -7123,45 +7312,82 @@
           <w:lang w:eastAsia="it-IT"/>
           <w14:ligatures w14:val="none"/>
         </w:rPr>
-        <w:t>my_db.mdr_reconciliation.MdrReconciliationAgentTopCandidates</w:t>
-      </w:r>
-      <w:proofErr w:type="spellEnd"/>
-    </w:p>
-    <w:p>
-      <w:pPr>
-        <w:pStyle w:val="Paragrafoelenco"/>
-        <w:rPr>
-          <w:rFonts w:ascii="Times New Roman" w:eastAsia="Times New Roman" w:hAnsi="Times New Roman" w:cs="Times New Roman"/>
-          <w:kern w:val="0"/>
-          <w:sz w:val="24"/>
-          <w:szCs w:val="24"/>
-          <w:lang w:eastAsia="it-IT"/>
-          <w14:ligatures w14:val="none"/>
-        </w:rPr>
-      </w:pPr>
-    </w:p>
-    <w:p>
-      <w:pPr>
-        <w:pStyle w:val="Paragrafoelenco"/>
-        <w:rPr>
-          <w:rFonts w:ascii="Times New Roman" w:eastAsia="Times New Roman" w:hAnsi="Times New Roman" w:cs="Times New Roman"/>
-          <w:kern w:val="0"/>
-          <w:sz w:val="24"/>
-          <w:szCs w:val="24"/>
-          <w:lang w:eastAsia="it-IT"/>
-          <w14:ligatures w14:val="none"/>
-        </w:rPr>
-      </w:pPr>
-      <w:r>
-        <w:rPr>
-          <w:rFonts w:ascii="Times New Roman" w:eastAsia="Times New Roman" w:hAnsi="Times New Roman" w:cs="Times New Roman"/>
-          <w:kern w:val="0"/>
-          <w:sz w:val="24"/>
-          <w:szCs w:val="24"/>
-          <w:lang w:eastAsia="it-IT"/>
-          <w14:ligatures w14:val="none"/>
-        </w:rPr>
-        <w:t>Contiene i top 3 candidati per agente.</w:t>
+        <w:t>my_db.mdr_</w:t>
+      </w:r>
+      <w:proofErr w:type="gramStart"/>
+      <w:r>
+        <w:rPr>
+          <w:rFonts w:ascii="Times New Roman" w:eastAsia="Times New Roman" w:hAnsi="Times New Roman" w:cs="Times New Roman"/>
+          <w:kern w:val="0"/>
+          <w:sz w:val="24"/>
+          <w:szCs w:val="24"/>
+          <w:lang w:eastAsia="it-IT"/>
+          <w14:ligatures w14:val="none"/>
+        </w:rPr>
+        <w:t>reconciliation.MdrReconciliationAgentTopCandidates</w:t>
+      </w:r>
+      <w:proofErr w:type="spellEnd"/>
+      <w:proofErr w:type="gramEnd"/>
+    </w:p>
+    <w:p>
+      <w:pPr>
+        <w:pStyle w:val="Paragrafoelenco"/>
+        <w:rPr>
+          <w:rFonts w:ascii="Times New Roman" w:eastAsia="Times New Roman" w:hAnsi="Times New Roman" w:cs="Times New Roman"/>
+          <w:kern w:val="0"/>
+          <w:sz w:val="24"/>
+          <w:szCs w:val="24"/>
+          <w:lang w:eastAsia="it-IT"/>
+          <w14:ligatures w14:val="none"/>
+        </w:rPr>
+      </w:pPr>
+    </w:p>
+    <w:p>
+      <w:pPr>
+        <w:pStyle w:val="Paragrafoelenco"/>
+        <w:rPr>
+          <w:rFonts w:ascii="Times New Roman" w:eastAsia="Times New Roman" w:hAnsi="Times New Roman" w:cs="Times New Roman"/>
+          <w:kern w:val="0"/>
+          <w:sz w:val="24"/>
+          <w:szCs w:val="24"/>
+          <w:lang w:eastAsia="it-IT"/>
+          <w14:ligatures w14:val="none"/>
+        </w:rPr>
+      </w:pPr>
+      <w:r>
+        <w:rPr>
+          <w:rFonts w:ascii="Times New Roman" w:eastAsia="Times New Roman" w:hAnsi="Times New Roman" w:cs="Times New Roman"/>
+          <w:kern w:val="0"/>
+          <w:sz w:val="24"/>
+          <w:szCs w:val="24"/>
+          <w:lang w:eastAsia="it-IT"/>
+          <w14:ligatures w14:val="none"/>
+        </w:rPr>
+        <w:t xml:space="preserve">Contiene i top </w:t>
+      </w:r>
+      <w:proofErr w:type="gramStart"/>
+      <w:r>
+        <w:rPr>
+          <w:rFonts w:ascii="Times New Roman" w:eastAsia="Times New Roman" w:hAnsi="Times New Roman" w:cs="Times New Roman"/>
+          <w:kern w:val="0"/>
+          <w:sz w:val="24"/>
+          <w:szCs w:val="24"/>
+          <w:lang w:eastAsia="it-IT"/>
+          <w14:ligatures w14:val="none"/>
+        </w:rPr>
+        <w:t>3</w:t>
+      </w:r>
+      <w:proofErr w:type="gramEnd"/>
+      <w:r>
+        <w:rPr>
+          <w:rFonts w:ascii="Times New Roman" w:eastAsia="Times New Roman" w:hAnsi="Times New Roman" w:cs="Times New Roman"/>
+          <w:kern w:val="0"/>
+          <w:sz w:val="24"/>
+          <w:szCs w:val="24"/>
+          <w:lang w:eastAsia="it-IT"/>
+          <w14:ligatures w14:val="none"/>
+        </w:rPr>
+        <w:t xml:space="preserve"> candidati per agente.</w:t>
       </w:r>
     </w:p>
     <w:p>
@@ -7641,9 +7867,22 @@
           <w:lang w:val="en-US" w:eastAsia="it-IT"/>
           <w14:ligatures w14:val="none"/>
         </w:rPr>
-        <w:t>my_db.mdr_reconciliation.MdrReconciliationResults</w:t>
-      </w:r>
-      <w:proofErr w:type="spellEnd"/>
+        <w:t>my_db.mdr_</w:t>
+      </w:r>
+      <w:proofErr w:type="gramStart"/>
+      <w:r>
+        <w:rPr>
+          <w:rFonts w:ascii="Times New Roman" w:eastAsia="Times New Roman" w:hAnsi="Times New Roman" w:cs="Times New Roman"/>
+          <w:kern w:val="0"/>
+          <w:sz w:val="24"/>
+          <w:szCs w:val="24"/>
+          <w:lang w:val="en-US" w:eastAsia="it-IT"/>
+          <w14:ligatures w14:val="none"/>
+        </w:rPr>
+        <w:t>reconciliation.MdrReconciliationResults</w:t>
+      </w:r>
+      <w:proofErr w:type="spellEnd"/>
+      <w:proofErr w:type="gramEnd"/>
     </w:p>
     <w:p>
       <w:pPr>
@@ -8344,9 +8583,22 @@
           <w:lang w:val="en-US" w:eastAsia="it-IT"/>
           <w14:ligatures w14:val="none"/>
         </w:rPr>
-        <w:t>my_db.mdr_reconciliation.MdrToRaciCandidates</w:t>
-      </w:r>
-      <w:proofErr w:type="spellEnd"/>
+        <w:t>my_db.mdr_</w:t>
+      </w:r>
+      <w:proofErr w:type="gramStart"/>
+      <w:r>
+        <w:rPr>
+          <w:rFonts w:ascii="Times New Roman" w:eastAsia="Times New Roman" w:hAnsi="Times New Roman" w:cs="Times New Roman"/>
+          <w:kern w:val="0"/>
+          <w:sz w:val="24"/>
+          <w:szCs w:val="24"/>
+          <w:lang w:val="en-US" w:eastAsia="it-IT"/>
+          <w14:ligatures w14:val="none"/>
+        </w:rPr>
+        <w:t>reconciliation.MdrToRaciCandidates</w:t>
+      </w:r>
+      <w:proofErr w:type="spellEnd"/>
+      <w:proofErr w:type="gramEnd"/>
     </w:p>
     <w:p>
       <w:pPr>
@@ -10004,7 +10256,19 @@
           <w:lang w:val="en-US" w:eastAsia="it-IT"/>
           <w14:ligatures w14:val="none"/>
         </w:rPr>
-        <w:t>load_agent_decision</w:t>
+        <w:t>load_agent_</w:t>
+      </w:r>
+      <w:proofErr w:type="gramStart"/>
+      <w:r>
+        <w:rPr>
+          <w:rFonts w:ascii="Times New Roman" w:eastAsia="Times New Roman" w:hAnsi="Times New Roman" w:cs="Times New Roman"/>
+          <w:kern w:val="0"/>
+          <w:sz w:val="24"/>
+          <w:szCs w:val="24"/>
+          <w:lang w:val="en-US" w:eastAsia="it-IT"/>
+          <w14:ligatures w14:val="none"/>
+        </w:rPr>
+        <w:t>decision</w:t>
       </w:r>
       <w:proofErr w:type="spellEnd"/>
       <w:r>
@@ -10019,6 +10283,7 @@
         <w:t>(</w:t>
       </w:r>
       <w:proofErr w:type="spellStart"/>
+      <w:proofErr w:type="gramEnd"/>
       <w:r>
         <w:rPr>
           <w:rFonts w:ascii="Times New Roman" w:eastAsia="Times New Roman" w:hAnsi="Times New Roman" w:cs="Times New Roman"/>
@@ -10100,7 +10365,19 @@
           <w:lang w:val="en-US" w:eastAsia="it-IT"/>
           <w14:ligatures w14:val="none"/>
         </w:rPr>
-        <w:t>load_agent_top_candidates</w:t>
+        <w:t>load_agent_top_</w:t>
+      </w:r>
+      <w:proofErr w:type="gramStart"/>
+      <w:r>
+        <w:rPr>
+          <w:rFonts w:ascii="Times New Roman" w:eastAsia="Times New Roman" w:hAnsi="Times New Roman" w:cs="Times New Roman"/>
+          <w:kern w:val="0"/>
+          <w:sz w:val="24"/>
+          <w:szCs w:val="24"/>
+          <w:lang w:val="en-US" w:eastAsia="it-IT"/>
+          <w14:ligatures w14:val="none"/>
+        </w:rPr>
+        <w:t>candidates</w:t>
       </w:r>
       <w:proofErr w:type="spellEnd"/>
       <w:r>
@@ -10115,6 +10392,7 @@
         <w:t>(</w:t>
       </w:r>
       <w:proofErr w:type="spellStart"/>
+      <w:proofErr w:type="gramEnd"/>
       <w:r>
         <w:rPr>
           <w:rFonts w:ascii="Times New Roman" w:eastAsia="Times New Roman" w:hAnsi="Times New Roman" w:cs="Times New Roman"/>
@@ -10196,7 +10474,19 @@
           <w:lang w:val="en-US" w:eastAsia="it-IT"/>
           <w14:ligatures w14:val="none"/>
         </w:rPr>
-        <w:t>load_retrieval_candidates</w:t>
+        <w:t>load_retrieval_</w:t>
+      </w:r>
+      <w:proofErr w:type="gramStart"/>
+      <w:r>
+        <w:rPr>
+          <w:rFonts w:ascii="Times New Roman" w:eastAsia="Times New Roman" w:hAnsi="Times New Roman" w:cs="Times New Roman"/>
+          <w:kern w:val="0"/>
+          <w:sz w:val="24"/>
+          <w:szCs w:val="24"/>
+          <w:lang w:val="en-US" w:eastAsia="it-IT"/>
+          <w14:ligatures w14:val="none"/>
+        </w:rPr>
+        <w:t>candidates</w:t>
       </w:r>
       <w:proofErr w:type="spellEnd"/>
       <w:r>
@@ -10211,6 +10501,7 @@
         <w:t>(</w:t>
       </w:r>
       <w:proofErr w:type="spellStart"/>
+      <w:proofErr w:type="gramEnd"/>
       <w:r>
         <w:rPr>
           <w:rFonts w:ascii="Times New Roman" w:eastAsia="Times New Roman" w:hAnsi="Times New Roman" w:cs="Times New Roman"/>
@@ -11162,6 +11453,12 @@
           <w:lang w:eastAsia="it-IT"/>
           <w14:ligatures w14:val="none"/>
         </w:rPr>
+        <w:br w:type="page"/>
+      </w:r>
+    </w:p>
+    <w:p>
+      <w:r>
+        <w:lastRenderedPageBreak/>
         <w:br w:type="page"/>
       </w:r>
     </w:p>
@@ -11406,36 +11703,60 @@
         <w:rPr>
           <w:lang w:val="en-US"/>
         </w:rPr>
-        <w:t>- decision_type</w:t>
-      </w:r>
-    </w:p>
-    <w:p>
-      <w:pPr>
-        <w:pStyle w:val="Paragrafoelenco"/>
-        <w:rPr>
-          <w:lang w:val="en-US"/>
-        </w:rPr>
-      </w:pPr>
-      <w:r>
-        <w:rPr>
-          <w:lang w:val="en-US"/>
-        </w:rPr>
-        <w:t xml:space="preserve">   - selected_titlekey</w:t>
-      </w:r>
-    </w:p>
-    <w:p>
-      <w:pPr>
-        <w:pStyle w:val="Paragrafoelenco"/>
-        <w:rPr>
-          <w:lang w:val="en-US"/>
-        </w:rPr>
-      </w:pPr>
-      <w:r>
-        <w:rPr>
-          <w:lang w:val="en-US"/>
-        </w:rPr>
-        <w:t xml:space="preserve">   - selected_raci_title</w:t>
-      </w:r>
+        <w:t xml:space="preserve">- </w:t>
+      </w:r>
+      <w:proofErr w:type="spellStart"/>
+      <w:r>
+        <w:rPr>
+          <w:lang w:val="en-US"/>
+        </w:rPr>
+        <w:t>decision_type</w:t>
+      </w:r>
+      <w:proofErr w:type="spellEnd"/>
+    </w:p>
+    <w:p>
+      <w:pPr>
+        <w:pStyle w:val="Paragrafoelenco"/>
+        <w:rPr>
+          <w:lang w:val="en-US"/>
+        </w:rPr>
+      </w:pPr>
+      <w:r>
+        <w:rPr>
+          <w:lang w:val="en-US"/>
+        </w:rPr>
+        <w:t xml:space="preserve">   - </w:t>
+      </w:r>
+      <w:proofErr w:type="spellStart"/>
+      <w:r>
+        <w:rPr>
+          <w:lang w:val="en-US"/>
+        </w:rPr>
+        <w:t>selected_titlekey</w:t>
+      </w:r>
+      <w:proofErr w:type="spellEnd"/>
+    </w:p>
+    <w:p>
+      <w:pPr>
+        <w:pStyle w:val="Paragrafoelenco"/>
+        <w:rPr>
+          <w:lang w:val="en-US"/>
+        </w:rPr>
+      </w:pPr>
+      <w:r>
+        <w:rPr>
+          <w:lang w:val="en-US"/>
+        </w:rPr>
+        <w:t xml:space="preserve">   - </w:t>
+      </w:r>
+      <w:proofErr w:type="spellStart"/>
+      <w:r>
+        <w:rPr>
+          <w:lang w:val="en-US"/>
+        </w:rPr>
+        <w:t>selected_raci_title</w:t>
+      </w:r>
+      <w:proofErr w:type="spellEnd"/>
     </w:p>
     <w:p>
       <w:pPr>
@@ -11490,7 +11811,15 @@
       </w:r>
       <w:proofErr w:type="spellEnd"/>
       <w:r>
-        <w:t xml:space="preserve">: fino a 3 candidati plausibili, ordinati per </w:t>
+        <w:t xml:space="preserve">: fino a </w:t>
+      </w:r>
+      <w:proofErr w:type="gramStart"/>
+      <w:r>
+        <w:t>3</w:t>
+      </w:r>
+      <w:proofErr w:type="gramEnd"/>
+      <w:r>
+        <w:t xml:space="preserve"> candidati plausibili, ordinati per </w:t>
       </w:r>
       <w:proofErr w:type="spellStart"/>
       <w:r>
@@ -11594,7 +11923,21 @@
         <w:rPr>
           <w:lang w:val="en-US"/>
         </w:rPr>
-        <w:t>- decisione Claude</w:t>
+        <w:t xml:space="preserve">- </w:t>
+      </w:r>
+      <w:proofErr w:type="spellStart"/>
+      <w:r>
+        <w:rPr>
+          <w:lang w:val="en-US"/>
+        </w:rPr>
+        <w:t>decisione</w:t>
+      </w:r>
+      <w:proofErr w:type="spellEnd"/>
+      <w:r>
+        <w:rPr>
+          <w:lang w:val="en-US"/>
+        </w:rPr>
+        <w:t xml:space="preserve"> Claude</w:t>
       </w:r>
     </w:p>
     <w:p>
@@ -11827,21 +12170,49 @@
         <w:rPr>
           <w:lang w:val="en-US"/>
         </w:rPr>
-        <w:t>5. se decision_type = NO_MATCH:</w:t>
-      </w:r>
-    </w:p>
-    <w:p>
-      <w:pPr>
-        <w:pStyle w:val="Paragrafoelenco"/>
-        <w:rPr>
-          <w:lang w:val="en-US"/>
-        </w:rPr>
-      </w:pPr>
-      <w:r>
-        <w:rPr>
-          <w:lang w:val="en-US"/>
-        </w:rPr>
-        <w:t xml:space="preserve">   - selected_titlekey = null</w:t>
+        <w:t xml:space="preserve">5. se </w:t>
+      </w:r>
+      <w:proofErr w:type="spellStart"/>
+      <w:r>
+        <w:rPr>
+          <w:lang w:val="en-US"/>
+        </w:rPr>
+        <w:t>decision_type</w:t>
+      </w:r>
+      <w:proofErr w:type="spellEnd"/>
+      <w:r>
+        <w:rPr>
+          <w:lang w:val="en-US"/>
+        </w:rPr>
+        <w:t xml:space="preserve"> = NO_MATCH:</w:t>
+      </w:r>
+    </w:p>
+    <w:p>
+      <w:pPr>
+        <w:pStyle w:val="Paragrafoelenco"/>
+        <w:rPr>
+          <w:lang w:val="en-US"/>
+        </w:rPr>
+      </w:pPr>
+      <w:r>
+        <w:rPr>
+          <w:lang w:val="en-US"/>
+        </w:rPr>
+        <w:t xml:space="preserve">   - </w:t>
+      </w:r>
+      <w:proofErr w:type="spellStart"/>
+      <w:r>
+        <w:rPr>
+          <w:lang w:val="en-US"/>
+        </w:rPr>
+        <w:t>selected_titlekey</w:t>
+      </w:r>
+      <w:proofErr w:type="spellEnd"/>
+      <w:r>
+        <w:rPr>
+          <w:lang w:val="en-US"/>
+        </w:rPr>
+        <w:t xml:space="preserve"> = null</w:t>
       </w:r>
     </w:p>
     <w:p>
@@ -11884,7 +12255,15 @@
       </w:r>
       <w:proofErr w:type="spellEnd"/>
       <w:r>
-        <w:t xml:space="preserve"> può essere vuoto oppure contenere fino a 3 candidati “</w:t>
+        <w:t xml:space="preserve"> può essere vuoto oppure contenere fino a </w:t>
+      </w:r>
+      <w:proofErr w:type="gramStart"/>
+      <w:r>
+        <w:t>3</w:t>
+      </w:r>
+      <w:proofErr w:type="gramEnd"/>
+      <w:r>
+        <w:t xml:space="preserve"> candidati “</w:t>
       </w:r>
       <w:proofErr w:type="spellStart"/>
       <w:r>
@@ -12059,35 +12438,129 @@
         <w:rPr>
           <w:lang w:val="en-US"/>
         </w:rPr>
-        <w:t xml:space="preserve">  "decision_type": "MATCH | NO_MATCH",</w:t>
-      </w:r>
-    </w:p>
-    <w:p>
-      <w:pPr>
-        <w:pStyle w:val="Paragrafoelenco"/>
-        <w:rPr>
-          <w:lang w:val="en-US"/>
-        </w:rPr>
-      </w:pPr>
-      <w:r>
-        <w:rPr>
-          <w:lang w:val="en-US"/>
-        </w:rPr>
-        <w:t xml:space="preserve">  "selected_titlekey": "string|null",</w:t>
-      </w:r>
-    </w:p>
-    <w:p>
-      <w:pPr>
-        <w:pStyle w:val="Paragrafoelenco"/>
-        <w:rPr>
-          <w:lang w:val="en-US"/>
-        </w:rPr>
-      </w:pPr>
-      <w:r>
-        <w:rPr>
-          <w:lang w:val="en-US"/>
-        </w:rPr>
-        <w:t xml:space="preserve">  "selected_raci_title": "string|null",</w:t>
+        <w:t xml:space="preserve">  "</w:t>
+      </w:r>
+      <w:proofErr w:type="spellStart"/>
+      <w:proofErr w:type="gramStart"/>
+      <w:r>
+        <w:rPr>
+          <w:lang w:val="en-US"/>
+        </w:rPr>
+        <w:t>decision</w:t>
+      </w:r>
+      <w:proofErr w:type="gramEnd"/>
+      <w:r>
+        <w:rPr>
+          <w:lang w:val="en-US"/>
+        </w:rPr>
+        <w:t>_type</w:t>
+      </w:r>
+      <w:proofErr w:type="spellEnd"/>
+      <w:r>
+        <w:rPr>
+          <w:lang w:val="en-US"/>
+        </w:rPr>
+        <w:t>": "MATCH | NO_MATCH",</w:t>
+      </w:r>
+    </w:p>
+    <w:p>
+      <w:pPr>
+        <w:pStyle w:val="Paragrafoelenco"/>
+        <w:rPr>
+          <w:lang w:val="en-US"/>
+        </w:rPr>
+      </w:pPr>
+      <w:r>
+        <w:rPr>
+          <w:lang w:val="en-US"/>
+        </w:rPr>
+        <w:t xml:space="preserve">  "</w:t>
+      </w:r>
+      <w:proofErr w:type="spellStart"/>
+      <w:proofErr w:type="gramStart"/>
+      <w:r>
+        <w:rPr>
+          <w:lang w:val="en-US"/>
+        </w:rPr>
+        <w:t>selected</w:t>
+      </w:r>
+      <w:proofErr w:type="gramEnd"/>
+      <w:r>
+        <w:rPr>
+          <w:lang w:val="en-US"/>
+        </w:rPr>
+        <w:t>_titlekey</w:t>
+      </w:r>
+      <w:proofErr w:type="spellEnd"/>
+      <w:r>
+        <w:rPr>
+          <w:lang w:val="en-US"/>
+        </w:rPr>
+        <w:t>": "</w:t>
+      </w:r>
+      <w:proofErr w:type="spellStart"/>
+      <w:r>
+        <w:rPr>
+          <w:lang w:val="en-US"/>
+        </w:rPr>
+        <w:t>string|null</w:t>
+      </w:r>
+      <w:proofErr w:type="spellEnd"/>
+      <w:r>
+        <w:rPr>
+          <w:lang w:val="en-US"/>
+        </w:rPr>
+        <w:t>",</w:t>
+      </w:r>
+    </w:p>
+    <w:p>
+      <w:pPr>
+        <w:pStyle w:val="Paragrafoelenco"/>
+        <w:rPr>
+          <w:lang w:val="en-US"/>
+        </w:rPr>
+      </w:pPr>
+      <w:r>
+        <w:rPr>
+          <w:lang w:val="en-US"/>
+        </w:rPr>
+        <w:t xml:space="preserve">  "</w:t>
+      </w:r>
+      <w:proofErr w:type="spellStart"/>
+      <w:proofErr w:type="gramStart"/>
+      <w:r>
+        <w:rPr>
+          <w:lang w:val="en-US"/>
+        </w:rPr>
+        <w:t>selected</w:t>
+      </w:r>
+      <w:proofErr w:type="gramEnd"/>
+      <w:r>
+        <w:rPr>
+          <w:lang w:val="en-US"/>
+        </w:rPr>
+        <w:t>_raci_title</w:t>
+      </w:r>
+      <w:proofErr w:type="spellEnd"/>
+      <w:r>
+        <w:rPr>
+          <w:lang w:val="en-US"/>
+        </w:rPr>
+        <w:t>": "</w:t>
+      </w:r>
+      <w:proofErr w:type="spellStart"/>
+      <w:r>
+        <w:rPr>
+          <w:lang w:val="en-US"/>
+        </w:rPr>
+        <w:t>string|null</w:t>
+      </w:r>
+      <w:proofErr w:type="spellEnd"/>
+      <w:r>
+        <w:rPr>
+          <w:lang w:val="en-US"/>
+        </w:rPr>
+        <w:t>",</w:t>
       </w:r>
     </w:p>
     <w:p>
@@ -12115,21 +12588,65 @@
         <w:rPr>
           <w:lang w:val="en-US"/>
         </w:rPr>
-        <w:t xml:space="preserve">  "reasoning_summary": "string",</w:t>
-      </w:r>
-    </w:p>
-    <w:p>
-      <w:pPr>
-        <w:pStyle w:val="Paragrafoelenco"/>
-        <w:rPr>
-          <w:lang w:val="en-US"/>
-        </w:rPr>
-      </w:pPr>
-      <w:r>
-        <w:rPr>
-          <w:lang w:val="en-US"/>
-        </w:rPr>
-        <w:t xml:space="preserve">  "top_candidates": [</w:t>
+        <w:t xml:space="preserve">  "</w:t>
+      </w:r>
+      <w:proofErr w:type="spellStart"/>
+      <w:proofErr w:type="gramStart"/>
+      <w:r>
+        <w:rPr>
+          <w:lang w:val="en-US"/>
+        </w:rPr>
+        <w:t>reasoning</w:t>
+      </w:r>
+      <w:proofErr w:type="gramEnd"/>
+      <w:r>
+        <w:rPr>
+          <w:lang w:val="en-US"/>
+        </w:rPr>
+        <w:t>_summary</w:t>
+      </w:r>
+      <w:proofErr w:type="spellEnd"/>
+      <w:r>
+        <w:rPr>
+          <w:lang w:val="en-US"/>
+        </w:rPr>
+        <w:t>": "string",</w:t>
+      </w:r>
+    </w:p>
+    <w:p>
+      <w:pPr>
+        <w:pStyle w:val="Paragrafoelenco"/>
+        <w:rPr>
+          <w:lang w:val="en-US"/>
+        </w:rPr>
+      </w:pPr>
+      <w:r>
+        <w:rPr>
+          <w:lang w:val="en-US"/>
+        </w:rPr>
+        <w:t xml:space="preserve">  "</w:t>
+      </w:r>
+      <w:proofErr w:type="spellStart"/>
+      <w:proofErr w:type="gramStart"/>
+      <w:r>
+        <w:rPr>
+          <w:lang w:val="en-US"/>
+        </w:rPr>
+        <w:t>top</w:t>
+      </w:r>
+      <w:proofErr w:type="gramEnd"/>
+      <w:r>
+        <w:rPr>
+          <w:lang w:val="en-US"/>
+        </w:rPr>
+        <w:t>_candidates</w:t>
+      </w:r>
+      <w:proofErr w:type="spellEnd"/>
+      <w:r>
+        <w:rPr>
+          <w:lang w:val="en-US"/>
+        </w:rPr>
+        <w:t>": [</w:t>
       </w:r>
     </w:p>
     <w:p>
@@ -12171,21 +12688,57 @@
         <w:rPr>
           <w:lang w:val="en-US"/>
         </w:rPr>
-        <w:t xml:space="preserve">      "titlekey": "string",</w:t>
-      </w:r>
-    </w:p>
-    <w:p>
-      <w:pPr>
-        <w:pStyle w:val="Paragrafoelenco"/>
-        <w:rPr>
-          <w:lang w:val="en-US"/>
-        </w:rPr>
-      </w:pPr>
-      <w:r>
-        <w:rPr>
-          <w:lang w:val="en-US"/>
-        </w:rPr>
-        <w:t xml:space="preserve">      "raci_title": "string",</w:t>
+        <w:t xml:space="preserve">      "</w:t>
+      </w:r>
+      <w:proofErr w:type="spellStart"/>
+      <w:r>
+        <w:rPr>
+          <w:lang w:val="en-US"/>
+        </w:rPr>
+        <w:t>titlekey</w:t>
+      </w:r>
+      <w:proofErr w:type="spellEnd"/>
+      <w:r>
+        <w:rPr>
+          <w:lang w:val="en-US"/>
+        </w:rPr>
+        <w:t>": "string",</w:t>
+      </w:r>
+    </w:p>
+    <w:p>
+      <w:pPr>
+        <w:pStyle w:val="Paragrafoelenco"/>
+        <w:rPr>
+          <w:lang w:val="en-US"/>
+        </w:rPr>
+      </w:pPr>
+      <w:r>
+        <w:rPr>
+          <w:lang w:val="en-US"/>
+        </w:rPr>
+        <w:t xml:space="preserve">      "</w:t>
+      </w:r>
+      <w:proofErr w:type="spellStart"/>
+      <w:proofErr w:type="gramStart"/>
+      <w:r>
+        <w:rPr>
+          <w:lang w:val="en-US"/>
+        </w:rPr>
+        <w:t>raci</w:t>
+      </w:r>
+      <w:proofErr w:type="gramEnd"/>
+      <w:r>
+        <w:rPr>
+          <w:lang w:val="en-US"/>
+        </w:rPr>
+        <w:t>_title</w:t>
+      </w:r>
+      <w:proofErr w:type="spellEnd"/>
+      <w:r>
+        <w:rPr>
+          <w:lang w:val="en-US"/>
+        </w:rPr>
+        <w:t>": "string",</w:t>
       </w:r>
     </w:p>
     <w:p>
@@ -12213,7 +12766,29 @@
         <w:rPr>
           <w:lang w:val="en-US"/>
         </w:rPr>
-        <w:t xml:space="preserve">      "why_plausible": "string"</w:t>
+        <w:t xml:space="preserve">      "</w:t>
+      </w:r>
+      <w:proofErr w:type="spellStart"/>
+      <w:proofErr w:type="gramStart"/>
+      <w:r>
+        <w:rPr>
+          <w:lang w:val="en-US"/>
+        </w:rPr>
+        <w:t>why</w:t>
+      </w:r>
+      <w:proofErr w:type="gramEnd"/>
+      <w:r>
+        <w:rPr>
+          <w:lang w:val="en-US"/>
+        </w:rPr>
+        <w:t>_plausible</w:t>
+      </w:r>
+      <w:proofErr w:type="spellEnd"/>
+      <w:r>
+        <w:rPr>
+          <w:lang w:val="en-US"/>
+        </w:rPr>
+        <w:t>": "string"</w:t>
       </w:r>
     </w:p>
     <w:p>
@@ -12273,11 +12848,19 @@
           <w:lang w:val="en-US"/>
         </w:rPr>
       </w:pPr>
-      <w:r>
-        <w:rPr>
-          <w:lang w:val="en-US"/>
-        </w:rPr>
-        <w:t>Regole:</w:t>
+      <w:proofErr w:type="spellStart"/>
+      <w:r>
+        <w:rPr>
+          <w:lang w:val="en-US"/>
+        </w:rPr>
+        <w:t>Regole</w:t>
+      </w:r>
+      <w:proofErr w:type="spellEnd"/>
+      <w:r>
+        <w:rPr>
+          <w:lang w:val="en-US"/>
+        </w:rPr>
+        <w:t>:</w:t>
       </w:r>
     </w:p>
     <w:p>
@@ -12293,7 +12876,15 @@
       </w:r>
       <w:proofErr w:type="spellEnd"/>
       <w:r>
-        <w:t xml:space="preserve"> massimo 3 elementi</w:t>
+        <w:t xml:space="preserve"> massimo </w:t>
+      </w:r>
+      <w:proofErr w:type="gramStart"/>
+      <w:r>
+        <w:t>3</w:t>
+      </w:r>
+      <w:proofErr w:type="gramEnd"/>
+      <w:r>
+        <w:t xml:space="preserve"> elementi</w:t>
       </w:r>
     </w:p>
     <w:p>
@@ -12309,7 +12900,15 @@
       </w:r>
       <w:proofErr w:type="spellEnd"/>
       <w:r>
-        <w:t xml:space="preserve"> deve essere 1..N senza buchi</w:t>
+        <w:t xml:space="preserve"> deve essere </w:t>
+      </w:r>
+      <w:proofErr w:type="gramStart"/>
+      <w:r>
+        <w:t>1..</w:t>
+      </w:r>
+      <w:proofErr w:type="gramEnd"/>
+      <w:r>
+        <w:t>N senza buchi</w:t>
       </w:r>
     </w:p>
     <w:p>
@@ -12491,8 +13090,58 @@
         <w:rPr>
           <w:lang w:val="en-US"/>
         </w:rPr>
-        <w:t>- se MATCH, rank 1 deve coincidere con selected_titlekey</w:t>
-      </w:r>
+        <w:t xml:space="preserve">- </w:t>
+      </w:r>
+      <w:proofErr w:type="spellStart"/>
+      <w:r>
+        <w:rPr>
+          <w:lang w:val="en-US"/>
+        </w:rPr>
+        <w:t>se</w:t>
+      </w:r>
+      <w:proofErr w:type="spellEnd"/>
+      <w:r>
+        <w:rPr>
+          <w:lang w:val="en-US"/>
+        </w:rPr>
+        <w:t xml:space="preserve"> MATCH, rank 1 </w:t>
+      </w:r>
+      <w:proofErr w:type="spellStart"/>
+      <w:r>
+        <w:rPr>
+          <w:lang w:val="en-US"/>
+        </w:rPr>
+        <w:t>deve</w:t>
+      </w:r>
+      <w:proofErr w:type="spellEnd"/>
+      <w:r>
+        <w:rPr>
+          <w:lang w:val="en-US"/>
+        </w:rPr>
+        <w:t xml:space="preserve"> </w:t>
+      </w:r>
+      <w:proofErr w:type="spellStart"/>
+      <w:r>
+        <w:rPr>
+          <w:lang w:val="en-US"/>
+        </w:rPr>
+        <w:t>coincidere</w:t>
+      </w:r>
+      <w:proofErr w:type="spellEnd"/>
+      <w:r>
+        <w:rPr>
+          <w:lang w:val="en-US"/>
+        </w:rPr>
+        <w:t xml:space="preserve"> con </w:t>
+      </w:r>
+      <w:proofErr w:type="spellStart"/>
+      <w:r>
+        <w:rPr>
+          <w:lang w:val="en-US"/>
+        </w:rPr>
+        <w:t>selected_titlekey</w:t>
+      </w:r>
+      <w:proofErr w:type="spellEnd"/>
     </w:p>
     <w:p>
       <w:pPr>
@@ -12513,59 +13162,9 @@
     <w:p>
       <w:pPr>
         <w:pStyle w:val="Paragrafoelenco"/>
-      </w:pPr>
-    </w:p>
-    <w:p>
-      <w:pPr>
-        <w:pStyle w:val="Paragrafoelenco"/>
-      </w:pPr>
-      <w:r>
-        <w:t>Aggiorna anche i user prompt builder per includere:</w:t>
-      </w:r>
-    </w:p>
-    <w:p>
-      <w:pPr>
-        <w:pStyle w:val="Paragrafoelenco"/>
-      </w:pPr>
-      <w:r>
-        <w:t>- Type_L2</w:t>
-      </w:r>
-    </w:p>
-    <w:p>
-      <w:pPr>
-        <w:pStyle w:val="Paragrafoelenco"/>
-      </w:pPr>
-      <w:r>
-        <w:t>- Type_L2_Status</w:t>
-      </w:r>
-    </w:p>
-    <w:p>
-      <w:pPr>
-        <w:pStyle w:val="Paragrafoelenco"/>
-      </w:pPr>
-      <w:r>
-        <w:t>- Type_L3</w:t>
-      </w:r>
-    </w:p>
-    <w:p>
-      <w:pPr>
-        <w:pStyle w:val="Paragrafoelenco"/>
-      </w:pPr>
-      <w:r>
-        <w:t>- Type_L3_Status</w:t>
-      </w:r>
-    </w:p>
-    <w:p>
-      <w:pPr>
-        <w:pStyle w:val="Paragrafoelenco"/>
-      </w:pPr>
-      <w:r>
-        <w:t>se disponibili nel contesto MDR</w:t>
-      </w:r>
-    </w:p>
-    <w:p>
-      <w:pPr>
-        <w:pStyle w:val="Paragrafoelenco"/>
+        <w:rPr>
+          <w:u w:val="single"/>
+        </w:rPr>
       </w:pPr>
     </w:p>
     <w:p>
@@ -12759,22 +13358,38 @@
         <w:rPr>
           <w:lang w:val="en-US"/>
         </w:rPr>
-        <w:t>- GPT = MATCH(X), Claude = MATCH(Y), X != Y</w:t>
-      </w:r>
-    </w:p>
-    <w:p>
-      <w:pPr>
-        <w:pStyle w:val="Paragrafoelenco"/>
-        <w:rPr>
-          <w:lang w:val="en-US"/>
-        </w:rPr>
-      </w:pPr>
+        <w:t xml:space="preserve">- GPT = MATCH(X), Claude = MATCH(Y), </w:t>
+      </w:r>
+      <w:proofErr w:type="gramStart"/>
+      <w:r>
+        <w:rPr>
+          <w:lang w:val="en-US"/>
+        </w:rPr>
+        <w:t>X !</w:t>
+      </w:r>
+      <w:proofErr w:type="gramEnd"/>
+      <w:r>
+        <w:rPr>
+          <w:lang w:val="en-US"/>
+        </w:rPr>
+        <w:t>= Y</w:t>
+      </w:r>
+    </w:p>
+    <w:p>
+      <w:pPr>
+        <w:pStyle w:val="Paragrafoelenco"/>
+        <w:rPr>
+          <w:lang w:val="en-US"/>
+        </w:rPr>
+      </w:pPr>
+      <w:proofErr w:type="spellStart"/>
       <w:r>
         <w:rPr>
           <w:lang w:val="en-US"/>
         </w:rPr>
         <w:t>oppure</w:t>
       </w:r>
+      <w:proofErr w:type="spellEnd"/>
     </w:p>
     <w:p>
       <w:pPr>
@@ -12797,12 +13412,14 @@
           <w:lang w:val="en-US"/>
         </w:rPr>
       </w:pPr>
+      <w:proofErr w:type="spellStart"/>
       <w:r>
         <w:rPr>
           <w:lang w:val="en-US"/>
         </w:rPr>
         <w:t>oppure</w:t>
       </w:r>
+      <w:proofErr w:type="spellEnd"/>
     </w:p>
     <w:p>
       <w:pPr>
@@ -12831,8 +13448,768 @@
         <w:pStyle w:val="Paragrafoelenco"/>
       </w:pPr>
       <w:r>
+        <w:t xml:space="preserve">Il prompt del </w:t>
+      </w:r>
+      <w:proofErr w:type="spellStart"/>
+      <w:r>
+        <w:t>judge</w:t>
+      </w:r>
+      <w:proofErr w:type="spellEnd"/>
+      <w:r>
+        <w:t xml:space="preserve"> deve chiarire:</w:t>
+      </w:r>
+    </w:p>
+    <w:p>
+      <w:pPr>
+        <w:pStyle w:val="Paragrafoelenco"/>
+      </w:pPr>
+      <w:r>
+        <w:t>- focus primario = top3 dei due agenti</w:t>
+      </w:r>
+    </w:p>
+    <w:p>
+      <w:pPr>
+        <w:pStyle w:val="Paragrafoelenco"/>
+      </w:pPr>
+      <w:r>
+        <w:t>- contesto completo di verifica = top50 candidati</w:t>
+      </w:r>
+    </w:p>
+    <w:p>
+      <w:pPr>
+        <w:pStyle w:val="Paragrafoelenco"/>
+      </w:pPr>
+      <w:r>
+        <w:t>- può scegliere solo tra i candidati del top50</w:t>
+      </w:r>
+    </w:p>
+    <w:p>
+      <w:pPr>
+        <w:pStyle w:val="Paragrafoelenco"/>
+      </w:pPr>
+      <w:r>
+        <w:t xml:space="preserve">- </w:t>
+      </w:r>
+      <w:proofErr w:type="spellStart"/>
+      <w:r>
+        <w:t>similarity</w:t>
+      </w:r>
+      <w:proofErr w:type="spellEnd"/>
+      <w:r>
+        <w:t xml:space="preserve"> è solo </w:t>
+      </w:r>
+      <w:proofErr w:type="spellStart"/>
+      <w:r>
+        <w:t>retrieval</w:t>
+      </w:r>
+      <w:proofErr w:type="spellEnd"/>
+      <w:r>
+        <w:t xml:space="preserve"> </w:t>
+      </w:r>
+      <w:proofErr w:type="spellStart"/>
+      <w:r>
+        <w:t>evidence</w:t>
+      </w:r>
+      <w:proofErr w:type="spellEnd"/>
+    </w:p>
+    <w:p>
+      <w:pPr>
+        <w:pStyle w:val="Paragrafoelenco"/>
+      </w:pPr>
+      <w:r>
+        <w:t>- metadata e semantica contano più del lessico puro</w:t>
+      </w:r>
+    </w:p>
+    <w:p>
+      <w:pPr>
+        <w:pStyle w:val="Paragrafoelenco"/>
+        <w:rPr>
+          <w:lang w:val="en-US"/>
+        </w:rPr>
+      </w:pPr>
+      <w:r>
+        <w:rPr>
+          <w:lang w:val="en-US"/>
+        </w:rPr>
+        <w:t xml:space="preserve">- </w:t>
+      </w:r>
+      <w:proofErr w:type="spellStart"/>
+      <w:r>
+        <w:rPr>
+          <w:lang w:val="en-US"/>
+        </w:rPr>
+        <w:t>può</w:t>
+      </w:r>
+      <w:proofErr w:type="spellEnd"/>
+      <w:r>
+        <w:rPr>
+          <w:lang w:val="en-US"/>
+        </w:rPr>
+        <w:t xml:space="preserve"> </w:t>
+      </w:r>
+      <w:proofErr w:type="spellStart"/>
+      <w:r>
+        <w:rPr>
+          <w:lang w:val="en-US"/>
+        </w:rPr>
+        <w:t>restituire</w:t>
+      </w:r>
+      <w:proofErr w:type="spellEnd"/>
+      <w:r>
+        <w:rPr>
+          <w:lang w:val="en-US"/>
+        </w:rPr>
+        <w:t>:</w:t>
+      </w:r>
+    </w:p>
+    <w:p>
+      <w:pPr>
+        <w:pStyle w:val="Paragrafoelenco"/>
+        <w:rPr>
+          <w:lang w:val="en-US"/>
+        </w:rPr>
+      </w:pPr>
+      <w:r>
+        <w:rPr>
+          <w:lang w:val="en-US"/>
+        </w:rPr>
         <w:lastRenderedPageBreak/>
-        <w:t xml:space="preserve">Il prompt del </w:t>
+        <w:t xml:space="preserve">  - MATCH</w:t>
+      </w:r>
+    </w:p>
+    <w:p>
+      <w:pPr>
+        <w:pStyle w:val="Paragrafoelenco"/>
+        <w:rPr>
+          <w:lang w:val="en-US"/>
+        </w:rPr>
+      </w:pPr>
+      <w:r>
+        <w:rPr>
+          <w:lang w:val="en-US"/>
+        </w:rPr>
+        <w:t xml:space="preserve">  - NO_MATCH</w:t>
+      </w:r>
+    </w:p>
+    <w:p>
+      <w:pPr>
+        <w:pStyle w:val="Paragrafoelenco"/>
+        <w:rPr>
+          <w:lang w:val="en-US"/>
+        </w:rPr>
+      </w:pPr>
+      <w:r>
+        <w:rPr>
+          <w:lang w:val="en-US"/>
+        </w:rPr>
+        <w:t xml:space="preserve">  - MANUAL_REVIEW</w:t>
+      </w:r>
+    </w:p>
+    <w:p>
+      <w:pPr>
+        <w:pStyle w:val="Paragrafoelenco"/>
+        <w:rPr>
+          <w:lang w:val="en-US"/>
+        </w:rPr>
+      </w:pPr>
+    </w:p>
+    <w:p>
+      <w:pPr>
+        <w:pStyle w:val="Paragrafoelenco"/>
+      </w:pPr>
+      <w:r>
+        <w:t>==================================================</w:t>
+      </w:r>
+    </w:p>
+    <w:p>
+      <w:pPr>
+        <w:pStyle w:val="Paragrafoelenco"/>
+      </w:pPr>
+      <w:r>
+        <w:t>NUOVO OUTPUT JSON RICHIESTO PER GEMINI</w:t>
+      </w:r>
+    </w:p>
+    <w:p>
+      <w:pPr>
+        <w:pStyle w:val="Paragrafoelenco"/>
+      </w:pPr>
+      <w:r>
+        <w:t>==================================================</w:t>
+      </w:r>
+    </w:p>
+    <w:p>
+      <w:pPr>
+        <w:pStyle w:val="Paragrafoelenco"/>
+      </w:pPr>
+    </w:p>
+    <w:p>
+      <w:pPr>
+        <w:pStyle w:val="Paragrafoelenco"/>
+      </w:pPr>
+      <w:r>
+        <w:t>Il formato target deve essere questo:</w:t>
+      </w:r>
+    </w:p>
+    <w:p>
+      <w:pPr>
+        <w:pStyle w:val="Paragrafoelenco"/>
+      </w:pPr>
+    </w:p>
+    <w:p>
+      <w:pPr>
+        <w:pStyle w:val="Paragrafoelenco"/>
+        <w:rPr>
+          <w:lang w:val="en-US"/>
+        </w:rPr>
+      </w:pPr>
+      <w:r>
+        <w:rPr>
+          <w:lang w:val="en-US"/>
+        </w:rPr>
+        <w:t>{</w:t>
+      </w:r>
+    </w:p>
+    <w:p>
+      <w:pPr>
+        <w:pStyle w:val="Paragrafoelenco"/>
+        <w:rPr>
+          <w:lang w:val="en-US"/>
+        </w:rPr>
+      </w:pPr>
+      <w:r>
+        <w:rPr>
+          <w:lang w:val="en-US"/>
+        </w:rPr>
+        <w:t xml:space="preserve">  "</w:t>
+      </w:r>
+      <w:proofErr w:type="spellStart"/>
+      <w:proofErr w:type="gramStart"/>
+      <w:r>
+        <w:rPr>
+          <w:lang w:val="en-US"/>
+        </w:rPr>
+        <w:t>decision</w:t>
+      </w:r>
+      <w:proofErr w:type="gramEnd"/>
+      <w:r>
+        <w:rPr>
+          <w:lang w:val="en-US"/>
+        </w:rPr>
+        <w:t>_type</w:t>
+      </w:r>
+      <w:proofErr w:type="spellEnd"/>
+      <w:r>
+        <w:rPr>
+          <w:lang w:val="en-US"/>
+        </w:rPr>
+        <w:t>": "MATCH | NO_MATCH | MANUAL_REVIEW",</w:t>
+      </w:r>
+    </w:p>
+    <w:p>
+      <w:pPr>
+        <w:pStyle w:val="Paragrafoelenco"/>
+        <w:rPr>
+          <w:lang w:val="en-US"/>
+        </w:rPr>
+      </w:pPr>
+      <w:r>
+        <w:rPr>
+          <w:lang w:val="en-US"/>
+        </w:rPr>
+        <w:t xml:space="preserve">  "</w:t>
+      </w:r>
+      <w:proofErr w:type="spellStart"/>
+      <w:proofErr w:type="gramStart"/>
+      <w:r>
+        <w:rPr>
+          <w:lang w:val="en-US"/>
+        </w:rPr>
+        <w:t>selected</w:t>
+      </w:r>
+      <w:proofErr w:type="gramEnd"/>
+      <w:r>
+        <w:rPr>
+          <w:lang w:val="en-US"/>
+        </w:rPr>
+        <w:t>_titlekey</w:t>
+      </w:r>
+      <w:proofErr w:type="spellEnd"/>
+      <w:r>
+        <w:rPr>
+          <w:lang w:val="en-US"/>
+        </w:rPr>
+        <w:t>": "</w:t>
+      </w:r>
+      <w:proofErr w:type="spellStart"/>
+      <w:r>
+        <w:rPr>
+          <w:lang w:val="en-US"/>
+        </w:rPr>
+        <w:t>string|null</w:t>
+      </w:r>
+      <w:proofErr w:type="spellEnd"/>
+      <w:r>
+        <w:rPr>
+          <w:lang w:val="en-US"/>
+        </w:rPr>
+        <w:t>",</w:t>
+      </w:r>
+    </w:p>
+    <w:p>
+      <w:pPr>
+        <w:pStyle w:val="Paragrafoelenco"/>
+        <w:rPr>
+          <w:lang w:val="en-US"/>
+        </w:rPr>
+      </w:pPr>
+      <w:r>
+        <w:rPr>
+          <w:lang w:val="en-US"/>
+        </w:rPr>
+        <w:t xml:space="preserve">  "</w:t>
+      </w:r>
+      <w:proofErr w:type="spellStart"/>
+      <w:proofErr w:type="gramStart"/>
+      <w:r>
+        <w:rPr>
+          <w:lang w:val="en-US"/>
+        </w:rPr>
+        <w:t>selected</w:t>
+      </w:r>
+      <w:proofErr w:type="gramEnd"/>
+      <w:r>
+        <w:rPr>
+          <w:lang w:val="en-US"/>
+        </w:rPr>
+        <w:t>_raci_title</w:t>
+      </w:r>
+      <w:proofErr w:type="spellEnd"/>
+      <w:r>
+        <w:rPr>
+          <w:lang w:val="en-US"/>
+        </w:rPr>
+        <w:t>": "</w:t>
+      </w:r>
+      <w:proofErr w:type="spellStart"/>
+      <w:r>
+        <w:rPr>
+          <w:lang w:val="en-US"/>
+        </w:rPr>
+        <w:t>string|null</w:t>
+      </w:r>
+      <w:proofErr w:type="spellEnd"/>
+      <w:r>
+        <w:rPr>
+          <w:lang w:val="en-US"/>
+        </w:rPr>
+        <w:t>",</w:t>
+      </w:r>
+    </w:p>
+    <w:p>
+      <w:pPr>
+        <w:pStyle w:val="Paragrafoelenco"/>
+        <w:rPr>
+          <w:lang w:val="en-US"/>
+        </w:rPr>
+      </w:pPr>
+      <w:r>
+        <w:rPr>
+          <w:lang w:val="en-US"/>
+        </w:rPr>
+        <w:t xml:space="preserve">  "confidence": 0.0,</w:t>
+      </w:r>
+    </w:p>
+    <w:p>
+      <w:pPr>
+        <w:pStyle w:val="Paragrafoelenco"/>
+        <w:rPr>
+          <w:lang w:val="en-US"/>
+        </w:rPr>
+      </w:pPr>
+      <w:r>
+        <w:rPr>
+          <w:lang w:val="en-US"/>
+        </w:rPr>
+        <w:t xml:space="preserve">  "</w:t>
+      </w:r>
+      <w:proofErr w:type="spellStart"/>
+      <w:proofErr w:type="gramStart"/>
+      <w:r>
+        <w:rPr>
+          <w:lang w:val="en-US"/>
+        </w:rPr>
+        <w:t>resolution</w:t>
+      </w:r>
+      <w:proofErr w:type="gramEnd"/>
+      <w:r>
+        <w:rPr>
+          <w:lang w:val="en-US"/>
+        </w:rPr>
+        <w:t>_mode</w:t>
+      </w:r>
+      <w:proofErr w:type="spellEnd"/>
+      <w:r>
+        <w:rPr>
+          <w:lang w:val="en-US"/>
+        </w:rPr>
+        <w:t>": "string",</w:t>
+      </w:r>
+    </w:p>
+    <w:p>
+      <w:pPr>
+        <w:pStyle w:val="Paragrafoelenco"/>
+        <w:rPr>
+          <w:lang w:val="en-US"/>
+        </w:rPr>
+      </w:pPr>
+      <w:r>
+        <w:rPr>
+          <w:lang w:val="en-US"/>
+        </w:rPr>
+        <w:t xml:space="preserve">  "</w:t>
+      </w:r>
+      <w:proofErr w:type="spellStart"/>
+      <w:proofErr w:type="gramStart"/>
+      <w:r>
+        <w:rPr>
+          <w:lang w:val="en-US"/>
+        </w:rPr>
+        <w:t>reasoning</w:t>
+      </w:r>
+      <w:proofErr w:type="gramEnd"/>
+      <w:r>
+        <w:rPr>
+          <w:lang w:val="en-US"/>
+        </w:rPr>
+        <w:t>_summary</w:t>
+      </w:r>
+      <w:proofErr w:type="spellEnd"/>
+      <w:r>
+        <w:rPr>
+          <w:lang w:val="en-US"/>
+        </w:rPr>
+        <w:t>": "string"</w:t>
+      </w:r>
+    </w:p>
+    <w:p>
+      <w:pPr>
+        <w:pStyle w:val="Paragrafoelenco"/>
+        <w:rPr>
+          <w:lang w:val="en-US"/>
+        </w:rPr>
+      </w:pPr>
+      <w:r>
+        <w:rPr>
+          <w:lang w:val="en-US"/>
+        </w:rPr>
+        <w:t>}</w:t>
+      </w:r>
+    </w:p>
+    <w:p>
+      <w:pPr>
+        <w:pStyle w:val="Paragrafoelenco"/>
+        <w:rPr>
+          <w:lang w:val="en-US"/>
+        </w:rPr>
+      </w:pPr>
+    </w:p>
+    <w:p>
+      <w:pPr>
+        <w:pStyle w:val="Paragrafoelenco"/>
+        <w:rPr>
+          <w:lang w:val="en-US"/>
+        </w:rPr>
+      </w:pPr>
+      <w:proofErr w:type="spellStart"/>
+      <w:r>
+        <w:rPr>
+          <w:lang w:val="en-US"/>
+        </w:rPr>
+        <w:t>Regole</w:t>
+      </w:r>
+      <w:proofErr w:type="spellEnd"/>
+      <w:r>
+        <w:rPr>
+          <w:lang w:val="en-US"/>
+        </w:rPr>
+        <w:t>:</w:t>
+      </w:r>
+    </w:p>
+    <w:p>
+      <w:pPr>
+        <w:pStyle w:val="Paragrafoelenco"/>
+        <w:rPr>
+          <w:lang w:val="en-US"/>
+        </w:rPr>
+      </w:pPr>
+      <w:r>
+        <w:rPr>
+          <w:lang w:val="en-US"/>
+        </w:rPr>
+        <w:t xml:space="preserve">- </w:t>
+      </w:r>
+      <w:proofErr w:type="spellStart"/>
+      <w:r>
+        <w:rPr>
+          <w:lang w:val="en-US"/>
+        </w:rPr>
+        <w:t>selected_titlekey</w:t>
+      </w:r>
+      <w:proofErr w:type="spellEnd"/>
+      <w:r>
+        <w:rPr>
+          <w:lang w:val="en-US"/>
+        </w:rPr>
+        <w:t xml:space="preserve"> e </w:t>
+      </w:r>
+      <w:proofErr w:type="spellStart"/>
+      <w:r>
+        <w:rPr>
+          <w:lang w:val="en-US"/>
+        </w:rPr>
+        <w:t>selected_raci_title</w:t>
+      </w:r>
+      <w:proofErr w:type="spellEnd"/>
+      <w:r>
+        <w:rPr>
+          <w:lang w:val="en-US"/>
+        </w:rPr>
+        <w:t xml:space="preserve"> </w:t>
+      </w:r>
+      <w:proofErr w:type="spellStart"/>
+      <w:r>
+        <w:rPr>
+          <w:lang w:val="en-US"/>
+        </w:rPr>
+        <w:t>devono</w:t>
+      </w:r>
+      <w:proofErr w:type="spellEnd"/>
+      <w:r>
+        <w:rPr>
+          <w:lang w:val="en-US"/>
+        </w:rPr>
+        <w:t xml:space="preserve"> </w:t>
+      </w:r>
+      <w:proofErr w:type="spellStart"/>
+      <w:r>
+        <w:rPr>
+          <w:lang w:val="en-US"/>
+        </w:rPr>
+        <w:t>essere</w:t>
+      </w:r>
+      <w:proofErr w:type="spellEnd"/>
+      <w:r>
+        <w:rPr>
+          <w:lang w:val="en-US"/>
+        </w:rPr>
+        <w:t xml:space="preserve"> null se </w:t>
+      </w:r>
+      <w:proofErr w:type="spellStart"/>
+      <w:r>
+        <w:rPr>
+          <w:lang w:val="en-US"/>
+        </w:rPr>
+        <w:t>decision_type</w:t>
+      </w:r>
+      <w:proofErr w:type="spellEnd"/>
+      <w:r>
+        <w:rPr>
+          <w:lang w:val="en-US"/>
+        </w:rPr>
+        <w:t xml:space="preserve"> è NO_MATCH o MANUAL_REVIEW</w:t>
+      </w:r>
+    </w:p>
+    <w:p>
+      <w:pPr>
+        <w:pStyle w:val="Paragrafoelenco"/>
+        <w:rPr>
+          <w:lang w:val="en-US"/>
+        </w:rPr>
+      </w:pPr>
+      <w:r>
+        <w:rPr>
+          <w:lang w:val="en-US"/>
+        </w:rPr>
+        <w:t xml:space="preserve">- confidence </w:t>
+      </w:r>
+      <w:proofErr w:type="spellStart"/>
+      <w:r>
+        <w:rPr>
+          <w:lang w:val="en-US"/>
+        </w:rPr>
+        <w:t>tra</w:t>
+      </w:r>
+      <w:proofErr w:type="spellEnd"/>
+      <w:r>
+        <w:rPr>
+          <w:lang w:val="en-US"/>
+        </w:rPr>
+        <w:t xml:space="preserve"> 0 e 1</w:t>
+      </w:r>
+    </w:p>
+    <w:p>
+      <w:pPr>
+        <w:pStyle w:val="Paragrafoelenco"/>
+      </w:pPr>
+      <w:r>
+        <w:t xml:space="preserve">- </w:t>
+      </w:r>
+      <w:proofErr w:type="spellStart"/>
+      <w:r>
+        <w:t>reasoning_summary</w:t>
+      </w:r>
+      <w:proofErr w:type="spellEnd"/>
+      <w:r>
+        <w:t xml:space="preserve"> breve e fattuale</w:t>
+      </w:r>
+    </w:p>
+    <w:p>
+      <w:pPr>
+        <w:pStyle w:val="Paragrafoelenco"/>
+      </w:pPr>
+      <w:r>
+        <w:t xml:space="preserve">- </w:t>
+      </w:r>
+      <w:proofErr w:type="spellStart"/>
+      <w:r>
+        <w:t>resolution_mode</w:t>
+      </w:r>
+      <w:proofErr w:type="spellEnd"/>
+      <w:r>
+        <w:t xml:space="preserve"> deve essere coerente con il conflitto risolto</w:t>
+      </w:r>
+    </w:p>
+    <w:p>
+      <w:pPr>
+        <w:pStyle w:val="Paragrafoelenco"/>
+      </w:pPr>
+    </w:p>
+    <w:p>
+      <w:pPr>
+        <w:pStyle w:val="Paragrafoelenco"/>
+      </w:pPr>
+      <w:r>
+        <w:t xml:space="preserve">Valori attesi di </w:t>
+      </w:r>
+      <w:proofErr w:type="spellStart"/>
+      <w:r>
+        <w:t>resolution_mode</w:t>
+      </w:r>
+      <w:proofErr w:type="spellEnd"/>
+      <w:r>
+        <w:t xml:space="preserve"> lato output Gemini:</w:t>
+      </w:r>
+    </w:p>
+    <w:p>
+      <w:pPr>
+        <w:pStyle w:val="Paragrafoelenco"/>
+        <w:rPr>
+          <w:lang w:val="en-US"/>
+        </w:rPr>
+      </w:pPr>
+      <w:r>
+        <w:rPr>
+          <w:lang w:val="en-US"/>
+        </w:rPr>
+        <w:t xml:space="preserve">- </w:t>
+      </w:r>
+      <w:proofErr w:type="spellStart"/>
+      <w:r>
+        <w:rPr>
+          <w:lang w:val="en-US"/>
+        </w:rPr>
+        <w:t>match_match_conflict_resolved</w:t>
+      </w:r>
+      <w:proofErr w:type="spellEnd"/>
+    </w:p>
+    <w:p>
+      <w:pPr>
+        <w:pStyle w:val="Paragrafoelenco"/>
+        <w:rPr>
+          <w:lang w:val="en-US"/>
+        </w:rPr>
+      </w:pPr>
+      <w:r>
+        <w:rPr>
+          <w:lang w:val="en-US"/>
+        </w:rPr>
+        <w:t xml:space="preserve">- </w:t>
+      </w:r>
+      <w:proofErr w:type="spellStart"/>
+      <w:r>
+        <w:rPr>
+          <w:lang w:val="en-US"/>
+        </w:rPr>
+        <w:t>match_no_match_conflict_resolved</w:t>
+      </w:r>
+      <w:proofErr w:type="spellEnd"/>
+    </w:p>
+    <w:p>
+      <w:pPr>
+        <w:pStyle w:val="Paragrafoelenco"/>
+      </w:pPr>
+      <w:r>
+        <w:t xml:space="preserve">- </w:t>
+      </w:r>
+      <w:proofErr w:type="spellStart"/>
+      <w:r>
+        <w:t>no_credible_candidate</w:t>
+      </w:r>
+      <w:proofErr w:type="spellEnd"/>
+    </w:p>
+    <w:p>
+      <w:pPr>
+        <w:pStyle w:val="Paragrafoelenco"/>
+      </w:pPr>
+      <w:r>
+        <w:t xml:space="preserve">- </w:t>
+      </w:r>
+      <w:proofErr w:type="spellStart"/>
+      <w:r>
+        <w:t>ambiguous_candidates</w:t>
+      </w:r>
+      <w:proofErr w:type="spellEnd"/>
+    </w:p>
+    <w:p>
+      <w:pPr>
+        <w:pStyle w:val="Paragrafoelenco"/>
+      </w:pPr>
+    </w:p>
+    <w:p>
+      <w:pPr>
+        <w:pStyle w:val="Paragrafoelenco"/>
+      </w:pPr>
+      <w:r>
+        <w:t>==================================================</w:t>
+      </w:r>
+    </w:p>
+    <w:p>
+      <w:pPr>
+        <w:pStyle w:val="Paragrafoelenco"/>
+      </w:pPr>
+      <w:r>
+        <w:t>INPUT ATTESO DAL JUDGE GEMINI</w:t>
+      </w:r>
+    </w:p>
+    <w:p>
+      <w:pPr>
+        <w:pStyle w:val="Paragrafoelenco"/>
+      </w:pPr>
+      <w:r>
+        <w:t>==================================================</w:t>
+      </w:r>
+    </w:p>
+    <w:p>
+      <w:pPr>
+        <w:pStyle w:val="Paragrafoelenco"/>
+      </w:pPr>
+    </w:p>
+    <w:p>
+      <w:pPr>
+        <w:pStyle w:val="Paragrafoelenco"/>
+      </w:pPr>
+      <w:r>
+        <w:t xml:space="preserve">Aggiorna il prompt builder del </w:t>
       </w:r>
       <w:proofErr w:type="spellStart"/>
       <w:r>
@@ -12840,124 +14217,971 @@
       </w:r>
       <w:proofErr w:type="spellEnd"/>
       <w:r>
-        <w:t xml:space="preserve"> deve chiarire:</w:t>
-      </w:r>
-    </w:p>
-    <w:p>
-      <w:pPr>
-        <w:pStyle w:val="Paragrafoelenco"/>
-      </w:pPr>
-      <w:r>
-        <w:t>- focus primario = top3 dei due agenti</w:t>
-      </w:r>
-    </w:p>
-    <w:p>
-      <w:pPr>
-        <w:pStyle w:val="Paragrafoelenco"/>
-      </w:pPr>
-      <w:r>
-        <w:t>- contesto completo di verifica = top50 candidati</w:t>
-      </w:r>
-    </w:p>
-    <w:p>
-      <w:pPr>
-        <w:pStyle w:val="Paragrafoelenco"/>
-      </w:pPr>
-      <w:r>
-        <w:t>- può scegliere solo tra i candidati del top50</w:t>
-      </w:r>
-    </w:p>
-    <w:p>
-      <w:pPr>
-        <w:pStyle w:val="Paragrafoelenco"/>
-      </w:pPr>
-      <w:r>
-        <w:t xml:space="preserve">- </w:t>
-      </w:r>
-      <w:proofErr w:type="spellStart"/>
-      <w:r>
-        <w:t>similarity</w:t>
-      </w:r>
-      <w:proofErr w:type="spellEnd"/>
-      <w:r>
-        <w:t xml:space="preserve"> è solo </w:t>
-      </w:r>
-      <w:proofErr w:type="spellStart"/>
-      <w:r>
-        <w:t>retrieval</w:t>
-      </w:r>
-      <w:proofErr w:type="spellEnd"/>
-      <w:r>
+        <w:t xml:space="preserve"> in modo che Gemini riceva queste sezioni:</w:t>
+      </w:r>
+    </w:p>
+    <w:p>
+      <w:pPr>
+        <w:pStyle w:val="Paragrafoelenco"/>
+      </w:pPr>
+    </w:p>
+    <w:p>
+      <w:pPr>
+        <w:pStyle w:val="Paragrafoelenco"/>
+      </w:pPr>
+      <w:r>
+        <w:t>1. HISTORICAL MDR RECORD</w:t>
+      </w:r>
+    </w:p>
+    <w:p>
+      <w:pPr>
+        <w:pStyle w:val="Paragrafoelenco"/>
+      </w:pPr>
+      <w:r>
+        <w:t xml:space="preserve">   - </w:t>
+      </w:r>
+      <w:proofErr w:type="spellStart"/>
+      <w:r>
+        <w:t>Document_title</w:t>
+      </w:r>
+      <w:proofErr w:type="spellEnd"/>
+    </w:p>
+    <w:p>
+      <w:pPr>
+        <w:pStyle w:val="Paragrafoelenco"/>
+      </w:pPr>
+      <w:r>
+        <w:t xml:space="preserve">   - </w:t>
+      </w:r>
+      <w:proofErr w:type="spellStart"/>
+      <w:r>
+        <w:t>Discipline_Normalized</w:t>
+      </w:r>
+      <w:proofErr w:type="spellEnd"/>
+    </w:p>
+    <w:p>
+      <w:pPr>
+        <w:pStyle w:val="Paragrafoelenco"/>
+      </w:pPr>
+      <w:r>
+        <w:t xml:space="preserve">   - </w:t>
+      </w:r>
+      <w:proofErr w:type="spellStart"/>
+      <w:r>
+        <w:t>Discipline_Status</w:t>
+      </w:r>
+      <w:proofErr w:type="spellEnd"/>
+    </w:p>
+    <w:p>
+      <w:pPr>
+        <w:pStyle w:val="Paragrafoelenco"/>
+      </w:pPr>
+      <w:r>
+        <w:t xml:space="preserve">   - Type_L1</w:t>
+      </w:r>
+    </w:p>
+    <w:p>
+      <w:pPr>
+        <w:pStyle w:val="Paragrafoelenco"/>
+        <w:rPr>
+          <w:lang w:val="en-US"/>
+        </w:rPr>
+      </w:pPr>
+      <w:r>
+        <w:t xml:space="preserve">   - Type_L1_Status</w:t>
+      </w:r>
+    </w:p>
+    <w:p>
+      <w:pPr>
+        <w:pStyle w:val="Paragrafoelenco"/>
+        <w:rPr>
+          <w:lang w:val="en-US"/>
+        </w:rPr>
+      </w:pPr>
+    </w:p>
+    <w:p>
+      <w:pPr>
+        <w:pStyle w:val="Paragrafoelenco"/>
+        <w:rPr>
+          <w:lang w:val="en-US"/>
+        </w:rPr>
+      </w:pPr>
+      <w:r>
+        <w:rPr>
+          <w:lang w:val="en-US"/>
+        </w:rPr>
+        <w:t>2. DISAGREEMENT TYPE</w:t>
+      </w:r>
+    </w:p>
+    <w:p>
+      <w:pPr>
+        <w:pStyle w:val="Paragrafoelenco"/>
+        <w:rPr>
+          <w:lang w:val="en-US"/>
+        </w:rPr>
+      </w:pPr>
+      <w:r>
+        <w:rPr>
+          <w:lang w:val="en-US"/>
+        </w:rPr>
+        <w:t xml:space="preserve">   - </w:t>
+      </w:r>
+      <w:proofErr w:type="spellStart"/>
+      <w:r>
+        <w:rPr>
+          <w:lang w:val="en-US"/>
+        </w:rPr>
+        <w:t>match_match_conflict</w:t>
+      </w:r>
+      <w:proofErr w:type="spellEnd"/>
+    </w:p>
+    <w:p>
+      <w:pPr>
+        <w:pStyle w:val="Paragrafoelenco"/>
+        <w:rPr>
+          <w:lang w:val="en-US"/>
+        </w:rPr>
+      </w:pPr>
+      <w:r>
+        <w:rPr>
+          <w:lang w:val="en-US"/>
+        </w:rPr>
+        <w:t xml:space="preserve">   - </w:t>
+      </w:r>
+      <w:proofErr w:type="spellStart"/>
+      <w:r>
+        <w:rPr>
+          <w:lang w:val="en-US"/>
+        </w:rPr>
+        <w:t>match_no_match_conflict</w:t>
+      </w:r>
+      <w:proofErr w:type="spellEnd"/>
+    </w:p>
+    <w:p>
+      <w:pPr>
+        <w:pStyle w:val="Paragrafoelenco"/>
+        <w:rPr>
+          <w:lang w:val="en-US"/>
+        </w:rPr>
+      </w:pPr>
+    </w:p>
+    <w:p>
+      <w:pPr>
+        <w:pStyle w:val="Paragrafoelenco"/>
+        <w:rPr>
+          <w:lang w:val="en-US"/>
+        </w:rPr>
+      </w:pPr>
+      <w:r>
+        <w:rPr>
+          <w:lang w:val="en-US"/>
+        </w:rPr>
+        <w:lastRenderedPageBreak/>
+        <w:t>3. AGENT DECISIONS</w:t>
+      </w:r>
+    </w:p>
+    <w:p>
+      <w:pPr>
+        <w:pStyle w:val="Paragrafoelenco"/>
+        <w:rPr>
+          <w:lang w:val="en-US"/>
+        </w:rPr>
+      </w:pPr>
+      <w:r>
+        <w:rPr>
+          <w:lang w:val="en-US"/>
+        </w:rPr>
+        <w:t xml:space="preserve">   - GPT decision</w:t>
+      </w:r>
+    </w:p>
+    <w:p>
+      <w:pPr>
+        <w:pStyle w:val="Paragrafoelenco"/>
+        <w:rPr>
+          <w:lang w:val="en-US"/>
+        </w:rPr>
+      </w:pPr>
+      <w:r>
+        <w:rPr>
+          <w:lang w:val="en-US"/>
+        </w:rPr>
+        <w:t xml:space="preserve">   - Claude decision</w:t>
+      </w:r>
+    </w:p>
+    <w:p>
+      <w:pPr>
+        <w:pStyle w:val="Paragrafoelenco"/>
+        <w:rPr>
+          <w:lang w:val="en-US"/>
+        </w:rPr>
+      </w:pPr>
+    </w:p>
+    <w:p>
+      <w:pPr>
+        <w:pStyle w:val="Paragrafoelenco"/>
+        <w:rPr>
+          <w:lang w:val="en-US"/>
+        </w:rPr>
+      </w:pPr>
+      <w:r>
+        <w:rPr>
+          <w:lang w:val="en-US"/>
+        </w:rPr>
+        <w:t>4. AGENT TOP CANDIDATES</w:t>
+      </w:r>
+    </w:p>
+    <w:p>
+      <w:pPr>
+        <w:pStyle w:val="Paragrafoelenco"/>
+        <w:rPr>
+          <w:lang w:val="en-US"/>
+        </w:rPr>
+      </w:pPr>
+      <w:r>
+        <w:rPr>
+          <w:lang w:val="en-US"/>
+        </w:rPr>
+        <w:t xml:space="preserve">   - top3 GPT</w:t>
+      </w:r>
+    </w:p>
+    <w:p>
+      <w:pPr>
+        <w:pStyle w:val="Paragrafoelenco"/>
+      </w:pPr>
+      <w:r>
+        <w:rPr>
+          <w:lang w:val="en-US"/>
+        </w:rPr>
+        <w:t xml:space="preserve">   </w:t>
+      </w:r>
+      <w:r>
+        <w:t>- top3 Claude</w:t>
+      </w:r>
+    </w:p>
+    <w:p>
+      <w:pPr>
+        <w:pStyle w:val="Paragrafoelenco"/>
+      </w:pPr>
+    </w:p>
+    <w:p>
+      <w:pPr>
+        <w:pStyle w:val="Paragrafoelenco"/>
+      </w:pPr>
+      <w:r>
+        <w:t>5. FULL TOP50 CANDIDATES</w:t>
+      </w:r>
+    </w:p>
+    <w:p>
+      <w:pPr>
+        <w:pStyle w:val="Paragrafoelenco"/>
+      </w:pPr>
+      <w:r>
+        <w:t xml:space="preserve">   - lista completa dei 50 candidati</w:t>
+      </w:r>
+    </w:p>
+    <w:p>
+      <w:pPr>
+        <w:pStyle w:val="Paragrafoelenco"/>
+      </w:pPr>
+    </w:p>
+    <w:p>
+      <w:pPr>
+        <w:pStyle w:val="Paragrafoelenco"/>
+      </w:pPr>
+      <w:r>
+        <w:t>Il prompt deve rendere esplicito che:</w:t>
+      </w:r>
+    </w:p>
+    <w:p>
+      <w:pPr>
+        <w:pStyle w:val="Paragrafoelenco"/>
+      </w:pPr>
+      <w:r>
+        <w:t>- i top3 agenti sono il focus principale</w:t>
+      </w:r>
+    </w:p>
+    <w:p>
+      <w:pPr>
+        <w:pStyle w:val="Paragrafoelenco"/>
+      </w:pPr>
+      <w:r>
+        <w:t>- i top50 servono per verificare se esiste un candidato migliore sfuggito ai due agenti</w:t>
+      </w:r>
+    </w:p>
+    <w:p>
+      <w:pPr>
+        <w:pStyle w:val="Paragrafoelenco"/>
+      </w:pPr>
+    </w:p>
+    <w:p>
+      <w:pPr>
+        <w:pStyle w:val="Paragrafoelenco"/>
+      </w:pPr>
+      <w:r>
+        <w:t>==================================================</w:t>
+      </w:r>
+    </w:p>
+    <w:p>
+      <w:pPr>
+        <w:pStyle w:val="Paragrafoelenco"/>
+      </w:pPr>
+      <w:r>
+        <w:t>RICHIESTE SUL REFACTOR</w:t>
+      </w:r>
+    </w:p>
+    <w:p>
+      <w:pPr>
+        <w:pStyle w:val="Paragrafoelenco"/>
+      </w:pPr>
+      <w:r>
+        <w:t>==================================================</w:t>
+      </w:r>
+    </w:p>
+    <w:p>
+      <w:pPr>
+        <w:pStyle w:val="Paragrafoelenco"/>
+      </w:pPr>
+    </w:p>
+    <w:p>
+      <w:pPr>
+        <w:pStyle w:val="Paragrafoelenco"/>
+      </w:pPr>
+      <w:r>
+        <w:t>Voglio che tu:</w:t>
+      </w:r>
+    </w:p>
+    <w:p>
+      <w:pPr>
+        <w:pStyle w:val="Paragrafoelenco"/>
+      </w:pPr>
+    </w:p>
+    <w:p>
+      <w:pPr>
+        <w:pStyle w:val="Paragrafoelenco"/>
+      </w:pPr>
+      <w:r>
+        <w:t>1. individui i file che definiscono:</w:t>
+      </w:r>
+    </w:p>
+    <w:p>
+      <w:pPr>
+        <w:pStyle w:val="Paragrafoelenco"/>
+        <w:rPr>
+          <w:lang w:val="en-US"/>
+        </w:rPr>
+      </w:pPr>
+      <w:r>
+        <w:t xml:space="preserve">   </w:t>
+      </w:r>
+      <w:r>
+        <w:rPr>
+          <w:lang w:val="en-US"/>
+        </w:rPr>
+        <w:t>- system prompt GPT</w:t>
+      </w:r>
+    </w:p>
+    <w:p>
+      <w:pPr>
+        <w:pStyle w:val="Paragrafoelenco"/>
+        <w:rPr>
+          <w:lang w:val="en-US"/>
+        </w:rPr>
+      </w:pPr>
+      <w:r>
+        <w:rPr>
+          <w:lang w:val="en-US"/>
+        </w:rPr>
+        <w:t xml:space="preserve">   - system prompt Claude</w:t>
+      </w:r>
+    </w:p>
+    <w:p>
+      <w:pPr>
+        <w:pStyle w:val="Paragrafoelenco"/>
+      </w:pPr>
+      <w:r>
+        <w:rPr>
+          <w:lang w:val="en-US"/>
+        </w:rPr>
+        <w:t xml:space="preserve">   </w:t>
+      </w:r>
+      <w:r>
+        <w:t>- system prompt Gemini</w:t>
+      </w:r>
+    </w:p>
+    <w:p>
+      <w:pPr>
+        <w:pStyle w:val="Paragrafoelenco"/>
+      </w:pPr>
+      <w:r>
+        <w:t xml:space="preserve">   - </w:t>
+      </w:r>
+      <w:proofErr w:type="spellStart"/>
+      <w:r>
+        <w:t>build_user_</w:t>
+      </w:r>
+      <w:proofErr w:type="gramStart"/>
+      <w:r>
+        <w:t>prompt</w:t>
+      </w:r>
+      <w:proofErr w:type="spellEnd"/>
+      <w:r>
+        <w:t>(</w:t>
+      </w:r>
+      <w:proofErr w:type="gramEnd"/>
+      <w:r>
+        <w:t>) dei tre agenti</w:t>
+      </w:r>
+    </w:p>
+    <w:p>
+      <w:pPr>
+        <w:pStyle w:val="Paragrafoelenco"/>
+      </w:pPr>
+      <w:r>
+        <w:t xml:space="preserve">   - parser / </w:t>
+      </w:r>
+      <w:proofErr w:type="spellStart"/>
+      <w:r>
+        <w:t>validator</w:t>
+      </w:r>
+      <w:proofErr w:type="spellEnd"/>
+      <w:r>
+        <w:t xml:space="preserve"> degli output JSON</w:t>
+      </w:r>
+    </w:p>
+    <w:p>
+      <w:pPr>
+        <w:pStyle w:val="Paragrafoelenco"/>
+      </w:pPr>
+      <w:r>
+        <w:t xml:space="preserve">   - eventuali modelli </w:t>
+      </w:r>
+      <w:proofErr w:type="spellStart"/>
+      <w:r>
+        <w:t>typed</w:t>
+      </w:r>
+      <w:proofErr w:type="spellEnd"/>
+      <w:r>
+        <w:t xml:space="preserve"> / </w:t>
+      </w:r>
+      <w:proofErr w:type="spellStart"/>
+      <w:r>
+        <w:t>dataclass</w:t>
+      </w:r>
+      <w:proofErr w:type="spellEnd"/>
+      <w:r>
+        <w:t xml:space="preserve"> / </w:t>
+      </w:r>
+      <w:proofErr w:type="spellStart"/>
+      <w:r>
+        <w:t>pydantic</w:t>
+      </w:r>
+      <w:proofErr w:type="spellEnd"/>
+    </w:p>
+    <w:p>
+      <w:pPr>
+        <w:pStyle w:val="Paragrafoelenco"/>
+      </w:pPr>
+    </w:p>
+    <w:p>
+      <w:pPr>
+        <w:pStyle w:val="Paragrafoelenco"/>
+      </w:pPr>
+      <w:r>
+        <w:t>2. aggiorni i prompt senza cambiare altre parti fuori scope</w:t>
+      </w:r>
+    </w:p>
+    <w:p>
+      <w:pPr>
+        <w:pStyle w:val="Paragrafoelenco"/>
+      </w:pPr>
+    </w:p>
+    <w:p>
+      <w:pPr>
+        <w:pStyle w:val="Paragrafoelenco"/>
+      </w:pPr>
+      <w:r>
+        <w:t>3. aggiorni i modelli dati in modo che supportino:</w:t>
+      </w:r>
+    </w:p>
+    <w:p>
+      <w:pPr>
+        <w:pStyle w:val="Paragrafoelenco"/>
+      </w:pPr>
+      <w:r>
+        <w:t xml:space="preserve">   - </w:t>
+      </w:r>
+      <w:proofErr w:type="spellStart"/>
+      <w:r>
+        <w:t>top_candidates</w:t>
+      </w:r>
+      <w:proofErr w:type="spellEnd"/>
+      <w:r>
+        <w:t xml:space="preserve"> per GPT e Claude</w:t>
+      </w:r>
+    </w:p>
+    <w:p>
+      <w:pPr>
+        <w:pStyle w:val="Paragrafoelenco"/>
+      </w:pPr>
+      <w:r>
+        <w:t xml:space="preserve">   - </w:t>
+      </w:r>
+      <w:proofErr w:type="spellStart"/>
+      <w:r>
+        <w:t>resolution_mode</w:t>
+      </w:r>
+      <w:proofErr w:type="spellEnd"/>
+      <w:r>
+        <w:t xml:space="preserve"> per Gemini</w:t>
+      </w:r>
+    </w:p>
+    <w:p>
+      <w:pPr>
+        <w:pStyle w:val="Paragrafoelenco"/>
+      </w:pPr>
+    </w:p>
+    <w:p>
+      <w:pPr>
+        <w:pStyle w:val="Paragrafoelenco"/>
+      </w:pPr>
+      <w:r>
+        <w:t xml:space="preserve">4. aggiorni eventuali parser JSON o </w:t>
+      </w:r>
+      <w:proofErr w:type="spellStart"/>
+      <w:r>
+        <w:t>validator</w:t>
+      </w:r>
+      <w:proofErr w:type="spellEnd"/>
+    </w:p>
+    <w:p>
+      <w:pPr>
+        <w:pStyle w:val="Paragrafoelenco"/>
+      </w:pPr>
+    </w:p>
+    <w:p>
+      <w:pPr>
+        <w:pStyle w:val="Paragrafoelenco"/>
+      </w:pPr>
+      <w:r>
+        <w:t>5. aggiorni eventuali test esistenti</w:t>
+      </w:r>
+    </w:p>
+    <w:p>
+      <w:pPr>
+        <w:pStyle w:val="Paragrafoelenco"/>
+      </w:pPr>
+    </w:p>
+    <w:p>
+      <w:pPr>
+        <w:pStyle w:val="Paragrafoelenco"/>
+      </w:pPr>
+      <w:r>
+        <w:t>==================================================</w:t>
+      </w:r>
+    </w:p>
+    <w:p>
+      <w:pPr>
+        <w:pStyle w:val="Paragrafoelenco"/>
+      </w:pPr>
+      <w:r>
+        <w:t>RICHIESTE IMPORTANTI</w:t>
+      </w:r>
+    </w:p>
+    <w:p>
+      <w:pPr>
+        <w:pStyle w:val="Paragrafoelenco"/>
+      </w:pPr>
+      <w:r>
+        <w:t>==================================================</w:t>
+      </w:r>
+    </w:p>
+    <w:p>
+      <w:pPr>
+        <w:pStyle w:val="Paragrafoelenco"/>
+      </w:pPr>
+    </w:p>
+    <w:p>
+      <w:pPr>
+        <w:pStyle w:val="Paragrafoelenco"/>
+      </w:pPr>
+      <w:r>
+        <w:t xml:space="preserve">- non cambiare la logica DB o lo script </w:t>
+      </w:r>
+      <w:proofErr w:type="spellStart"/>
+      <w:r>
+        <w:t>judge</w:t>
+      </w:r>
+      <w:proofErr w:type="spellEnd"/>
+      <w:r>
+        <w:t xml:space="preserve"> qui, salvo il minimo necessario per supportare i nuovi schema output</w:t>
+      </w:r>
+    </w:p>
+    <w:p>
+      <w:pPr>
+        <w:pStyle w:val="Paragrafoelenco"/>
+      </w:pPr>
+      <w:r>
+        <w:t>- non introdurre campi non richiesti</w:t>
+      </w:r>
+    </w:p>
+    <w:p>
+      <w:pPr>
+        <w:pStyle w:val="Paragrafoelenco"/>
+      </w:pPr>
+      <w:r>
+        <w:t>- non cambiare nomi di file o funzioni inutilmente</w:t>
+      </w:r>
+    </w:p>
+    <w:p>
+      <w:pPr>
+        <w:pStyle w:val="Paragrafoelenco"/>
+      </w:pPr>
+      <w:r>
+        <w:t>- mantieni il codice coerente con l’architettura attuale</w:t>
+      </w:r>
+    </w:p>
+    <w:p>
+      <w:pPr>
+        <w:pStyle w:val="Paragrafoelenco"/>
+      </w:pPr>
+      <w:r>
+        <w:t xml:space="preserve">- se esistono output schema </w:t>
+      </w:r>
+      <w:proofErr w:type="spellStart"/>
+      <w:r>
+        <w:t>hardcoded</w:t>
+      </w:r>
+      <w:proofErr w:type="spellEnd"/>
+      <w:r>
+        <w:t>, aggiornali</w:t>
+      </w:r>
+    </w:p>
+    <w:p>
+      <w:pPr>
+        <w:pStyle w:val="Paragrafoelenco"/>
+      </w:pPr>
+      <w:r>
+        <w:lastRenderedPageBreak/>
+        <w:t>- se ci sono prompt duplicati o molto simili tra GPT e Claude, riusa il più possibile senza rompere il codice</w:t>
+      </w:r>
+    </w:p>
+    <w:p>
+      <w:pPr>
+        <w:pStyle w:val="Paragrafoelenco"/>
+      </w:pPr>
+      <w:r>
+        <w:t xml:space="preserve">- se serve, estrai </w:t>
+      </w:r>
+      <w:proofErr w:type="spellStart"/>
+      <w:r>
+        <w:t>helper</w:t>
+      </w:r>
+      <w:proofErr w:type="spellEnd"/>
+      <w:r>
+        <w:t xml:space="preserve"> comuni per il rendering di </w:t>
+      </w:r>
+      <w:proofErr w:type="spellStart"/>
+      <w:r>
+        <w:t>top_candidates</w:t>
+      </w:r>
+      <w:proofErr w:type="spellEnd"/>
+    </w:p>
+    <w:p>
+      <w:pPr>
+        <w:pStyle w:val="Paragrafoelenco"/>
+      </w:pPr>
+    </w:p>
+    <w:p>
+      <w:pPr>
+        <w:pStyle w:val="Paragrafoelenco"/>
+      </w:pPr>
+      <w:r>
+        <w:t>==================================================</w:t>
+      </w:r>
+    </w:p>
+    <w:p>
+      <w:pPr>
+        <w:pStyle w:val="Paragrafoelenco"/>
+      </w:pPr>
+      <w:r>
+        <w:t>CASI DI TEST DA COPRIRE</w:t>
+      </w:r>
+    </w:p>
+    <w:p>
+      <w:pPr>
+        <w:pStyle w:val="Paragrafoelenco"/>
+      </w:pPr>
+      <w:r>
+        <w:t>==================================================</w:t>
+      </w:r>
+    </w:p>
+    <w:p>
+      <w:pPr>
+        <w:pStyle w:val="Paragrafoelenco"/>
+      </w:pPr>
+    </w:p>
+    <w:p>
+      <w:pPr>
+        <w:pStyle w:val="Paragrafoelenco"/>
+      </w:pPr>
+      <w:r>
+        <w:t>Voglio almeno questi casi:</w:t>
+      </w:r>
+    </w:p>
+    <w:p>
+      <w:pPr>
+        <w:pStyle w:val="Paragrafoelenco"/>
+      </w:pPr>
+    </w:p>
+    <w:p>
+      <w:pPr>
+        <w:pStyle w:val="Paragrafoelenco"/>
+      </w:pPr>
+      <w:r>
+        <w:t>AGENT GPT/CLAUDE</w:t>
+      </w:r>
+    </w:p>
+    <w:p>
+      <w:pPr>
+        <w:pStyle w:val="Paragrafoelenco"/>
+        <w:rPr>
+          <w:lang w:val="en-US"/>
+        </w:rPr>
+      </w:pPr>
+      <w:r>
+        <w:rPr>
+          <w:lang w:val="en-US"/>
+        </w:rPr>
+        <w:t xml:space="preserve">1. MATCH con </w:t>
+      </w:r>
+      <w:proofErr w:type="spellStart"/>
+      <w:r>
+        <w:rPr>
+          <w:lang w:val="en-US"/>
+        </w:rPr>
+        <w:t>top_</w:t>
+      </w:r>
+      <w:proofErr w:type="gramStart"/>
+      <w:r>
+        <w:rPr>
+          <w:lang w:val="en-US"/>
+        </w:rPr>
+        <w:t>candidates</w:t>
+      </w:r>
+      <w:proofErr w:type="spellEnd"/>
+      <w:r>
+        <w:rPr>
+          <w:lang w:val="en-US"/>
+        </w:rPr>
+        <w:t>[</w:t>
+      </w:r>
+      <w:proofErr w:type="gramEnd"/>
+      <w:r>
+        <w:rPr>
+          <w:lang w:val="en-US"/>
+        </w:rPr>
+        <w:t xml:space="preserve">0] </w:t>
+      </w:r>
+      <w:proofErr w:type="spellStart"/>
+      <w:r>
+        <w:rPr>
+          <w:lang w:val="en-US"/>
+        </w:rPr>
+        <w:t>uguale</w:t>
+      </w:r>
+      <w:proofErr w:type="spellEnd"/>
+      <w:r>
+        <w:rPr>
+          <w:lang w:val="en-US"/>
+        </w:rPr>
+        <w:t xml:space="preserve"> a </w:t>
+      </w:r>
+      <w:proofErr w:type="spellStart"/>
+      <w:r>
+        <w:rPr>
+          <w:lang w:val="en-US"/>
+        </w:rPr>
+        <w:t>selected_titlekey</w:t>
+      </w:r>
+      <w:proofErr w:type="spellEnd"/>
+    </w:p>
+    <w:p>
+      <w:pPr>
+        <w:pStyle w:val="Paragrafoelenco"/>
+        <w:rPr>
+          <w:lang w:val="en-US"/>
+        </w:rPr>
+      </w:pPr>
+      <w:r>
+        <w:rPr>
+          <w:lang w:val="en-US"/>
+        </w:rPr>
+        <w:t xml:space="preserve">2. NO_MATCH con </w:t>
+      </w:r>
+      <w:proofErr w:type="spellStart"/>
+      <w:r>
+        <w:rPr>
+          <w:lang w:val="en-US"/>
+        </w:rPr>
+        <w:t>top_candidates</w:t>
+      </w:r>
+      <w:proofErr w:type="spellEnd"/>
+      <w:r>
+        <w:rPr>
+          <w:lang w:val="en-US"/>
+        </w:rPr>
         <w:t xml:space="preserve"> </w:t>
       </w:r>
       <w:proofErr w:type="spellStart"/>
       <w:r>
-        <w:t>evidence</w:t>
-      </w:r>
-      <w:proofErr w:type="spellEnd"/>
-    </w:p>
-    <w:p>
-      <w:pPr>
-        <w:pStyle w:val="Paragrafoelenco"/>
-      </w:pPr>
-      <w:r>
-        <w:t>- metadata e semantica contano più del lessico puro</w:t>
-      </w:r>
-    </w:p>
-    <w:p>
-      <w:pPr>
-        <w:pStyle w:val="Paragrafoelenco"/>
-        <w:rPr>
-          <w:lang w:val="en-US"/>
-        </w:rPr>
-      </w:pPr>
-      <w:r>
-        <w:rPr>
-          <w:lang w:val="en-US"/>
-        </w:rPr>
-        <w:t>- può restituire:</w:t>
-      </w:r>
-    </w:p>
-    <w:p>
-      <w:pPr>
-        <w:pStyle w:val="Paragrafoelenco"/>
-        <w:rPr>
-          <w:lang w:val="en-US"/>
-        </w:rPr>
-      </w:pPr>
-      <w:r>
-        <w:rPr>
-          <w:lang w:val="en-US"/>
-        </w:rPr>
-        <w:t xml:space="preserve">  - MATCH</w:t>
-      </w:r>
-    </w:p>
-    <w:p>
-      <w:pPr>
-        <w:pStyle w:val="Paragrafoelenco"/>
-        <w:rPr>
-          <w:lang w:val="en-US"/>
-        </w:rPr>
-      </w:pPr>
-      <w:r>
-        <w:rPr>
-          <w:lang w:val="en-US"/>
-        </w:rPr>
-        <w:t xml:space="preserve">  - NO_MATCH</w:t>
-      </w:r>
-    </w:p>
-    <w:p>
-      <w:pPr>
-        <w:pStyle w:val="Paragrafoelenco"/>
-        <w:rPr>
-          <w:lang w:val="en-US"/>
-        </w:rPr>
-      </w:pPr>
-      <w:r>
-        <w:rPr>
-          <w:lang w:val="en-US"/>
-        </w:rPr>
-        <w:t xml:space="preserve">  - MANUAL_REVIEW</w:t>
+        <w:rPr>
+          <w:lang w:val="en-US"/>
+        </w:rPr>
+        <w:t>vuoto</w:t>
+      </w:r>
+      <w:proofErr w:type="spellEnd"/>
+    </w:p>
+    <w:p>
+      <w:pPr>
+        <w:pStyle w:val="Paragrafoelenco"/>
+      </w:pPr>
+      <w:r>
+        <w:t xml:space="preserve">3. NO_MATCH con </w:t>
+      </w:r>
+      <w:proofErr w:type="spellStart"/>
+      <w:r>
+        <w:t>top_candidates</w:t>
+      </w:r>
+      <w:proofErr w:type="spellEnd"/>
+      <w:r>
+        <w:t xml:space="preserve"> presenti ma insufficienti</w:t>
+      </w:r>
+    </w:p>
+    <w:p>
+      <w:pPr>
+        <w:pStyle w:val="Paragrafoelenco"/>
+      </w:pPr>
+      <w:r>
+        <w:t xml:space="preserve">4. </w:t>
+      </w:r>
+      <w:proofErr w:type="spellStart"/>
+      <w:r>
+        <w:t>invalid</w:t>
+      </w:r>
+      <w:proofErr w:type="spellEnd"/>
+      <w:r>
+        <w:t xml:space="preserve"> output se </w:t>
+      </w:r>
+      <w:proofErr w:type="spellStart"/>
+      <w:r>
+        <w:t>rank</w:t>
+      </w:r>
+      <w:proofErr w:type="spellEnd"/>
+      <w:r>
+        <w:t xml:space="preserve"> non parte da 1 o se ci sono duplicati</w:t>
+      </w:r>
+    </w:p>
+    <w:p>
+      <w:pPr>
+        <w:pStyle w:val="Paragrafoelenco"/>
+      </w:pPr>
+    </w:p>
+    <w:p>
+      <w:pPr>
+        <w:pStyle w:val="Paragrafoelenco"/>
+        <w:rPr>
+          <w:lang w:val="en-US"/>
+        </w:rPr>
+      </w:pPr>
+      <w:r>
+        <w:rPr>
+          <w:lang w:val="en-US"/>
+        </w:rPr>
+        <w:t>JUDGE GEMINI</w:t>
+      </w:r>
+    </w:p>
+    <w:p>
+      <w:pPr>
+        <w:pStyle w:val="Paragrafoelenco"/>
+        <w:rPr>
+          <w:lang w:val="en-US"/>
+        </w:rPr>
+      </w:pPr>
+      <w:r>
+        <w:rPr>
+          <w:lang w:val="en-US"/>
+        </w:rPr>
+        <w:t>5. conflict MATCH vs MATCH</w:t>
+      </w:r>
+    </w:p>
+    <w:p>
+      <w:pPr>
+        <w:pStyle w:val="Paragrafoelenco"/>
+        <w:rPr>
+          <w:lang w:val="en-US"/>
+        </w:rPr>
+      </w:pPr>
+      <w:r>
+        <w:rPr>
+          <w:lang w:val="en-US"/>
+        </w:rPr>
+        <w:t>6. conflict MATCH vs NO_MATCH</w:t>
+      </w:r>
+    </w:p>
+    <w:p>
+      <w:pPr>
+        <w:pStyle w:val="Paragrafoelenco"/>
+        <w:rPr>
+          <w:lang w:val="en-US"/>
+        </w:rPr>
+      </w:pPr>
+      <w:r>
+        <w:rPr>
+          <w:lang w:val="en-US"/>
+        </w:rPr>
+        <w:t xml:space="preserve">7. valid output NO_MATCH con </w:t>
+      </w:r>
+      <w:proofErr w:type="spellStart"/>
+      <w:r>
+        <w:rPr>
+          <w:lang w:val="en-US"/>
+        </w:rPr>
+        <w:t>selected_titlekey</w:t>
+      </w:r>
+      <w:proofErr w:type="spellEnd"/>
+      <w:r>
+        <w:rPr>
+          <w:lang w:val="en-US"/>
+        </w:rPr>
+        <w:t xml:space="preserve"> = null</w:t>
+      </w:r>
+    </w:p>
+    <w:p>
+      <w:pPr>
+        <w:pStyle w:val="Paragrafoelenco"/>
+        <w:rPr>
+          <w:lang w:val="en-US"/>
+        </w:rPr>
+      </w:pPr>
+      <w:r>
+        <w:rPr>
+          <w:lang w:val="en-US"/>
+        </w:rPr>
+        <w:t xml:space="preserve">8. valid output MANUAL_REVIEW con </w:t>
+      </w:r>
+      <w:proofErr w:type="spellStart"/>
+      <w:r>
+        <w:rPr>
+          <w:lang w:val="en-US"/>
+        </w:rPr>
+        <w:t>selected_titlekey</w:t>
+      </w:r>
+      <w:proofErr w:type="spellEnd"/>
+      <w:r>
+        <w:rPr>
+          <w:lang w:val="en-US"/>
+        </w:rPr>
+        <w:t xml:space="preserve"> = null</w:t>
       </w:r>
     </w:p>
     <w:p>
@@ -12981,7 +15205,7 @@
         <w:pStyle w:val="Paragrafoelenco"/>
       </w:pPr>
       <w:r>
-        <w:t>NUOVO OUTPUT JSON RICHIESTO PER GEMINI</w:t>
+        <w:t>OUTPUT ATTESO DA TE</w:t>
       </w:r>
     </w:p>
     <w:p>
@@ -13002,344 +15226,71 @@
         <w:pStyle w:val="Paragrafoelenco"/>
       </w:pPr>
       <w:r>
-        <w:t>Il formato target deve essere questo:</w:t>
-      </w:r>
-    </w:p>
-    <w:p>
-      <w:pPr>
-        <w:pStyle w:val="Paragrafoelenco"/>
-      </w:pPr>
-    </w:p>
-    <w:p>
-      <w:pPr>
-        <w:pStyle w:val="Paragrafoelenco"/>
-        <w:rPr>
-          <w:lang w:val="en-US"/>
-        </w:rPr>
-      </w:pPr>
-      <w:r>
-        <w:rPr>
-          <w:lang w:val="en-US"/>
-        </w:rPr>
-        <w:t>{</w:t>
-      </w:r>
-    </w:p>
-    <w:p>
-      <w:pPr>
-        <w:pStyle w:val="Paragrafoelenco"/>
-        <w:rPr>
-          <w:lang w:val="en-US"/>
-        </w:rPr>
-      </w:pPr>
-      <w:r>
-        <w:rPr>
-          <w:lang w:val="en-US"/>
-        </w:rPr>
-        <w:t xml:space="preserve">  "decision_type": "MATCH | NO_MATCH | MANUAL_REVIEW",</w:t>
-      </w:r>
-    </w:p>
-    <w:p>
-      <w:pPr>
-        <w:pStyle w:val="Paragrafoelenco"/>
-        <w:rPr>
-          <w:lang w:val="en-US"/>
-        </w:rPr>
-      </w:pPr>
-      <w:r>
-        <w:rPr>
-          <w:lang w:val="en-US"/>
-        </w:rPr>
-        <w:t xml:space="preserve">  "selected_titlekey": "string|null",</w:t>
-      </w:r>
-    </w:p>
-    <w:p>
-      <w:pPr>
-        <w:pStyle w:val="Paragrafoelenco"/>
-        <w:rPr>
-          <w:lang w:val="en-US"/>
-        </w:rPr>
-      </w:pPr>
-      <w:r>
-        <w:rPr>
-          <w:lang w:val="en-US"/>
-        </w:rPr>
-        <w:t xml:space="preserve">  "selected_raci_title": "string|null",</w:t>
-      </w:r>
-    </w:p>
-    <w:p>
-      <w:pPr>
-        <w:pStyle w:val="Paragrafoelenco"/>
-        <w:rPr>
-          <w:lang w:val="en-US"/>
-        </w:rPr>
-      </w:pPr>
-      <w:r>
-        <w:rPr>
-          <w:lang w:val="en-US"/>
-        </w:rPr>
-        <w:t xml:space="preserve">  "confidence": 0.0,</w:t>
-      </w:r>
-    </w:p>
-    <w:p>
-      <w:pPr>
-        <w:pStyle w:val="Paragrafoelenco"/>
-        <w:rPr>
-          <w:lang w:val="en-US"/>
-        </w:rPr>
-      </w:pPr>
-      <w:r>
-        <w:rPr>
-          <w:lang w:val="en-US"/>
-        </w:rPr>
-        <w:t xml:space="preserve">  "resolution_mode": "string",</w:t>
-      </w:r>
-    </w:p>
-    <w:p>
-      <w:pPr>
-        <w:pStyle w:val="Paragrafoelenco"/>
-        <w:rPr>
-          <w:lang w:val="en-US"/>
-        </w:rPr>
-      </w:pPr>
-      <w:r>
-        <w:rPr>
-          <w:lang w:val="en-US"/>
-        </w:rPr>
-        <w:t xml:space="preserve">  "reasoning_summary": "string"</w:t>
-      </w:r>
-    </w:p>
-    <w:p>
-      <w:pPr>
-        <w:pStyle w:val="Paragrafoelenco"/>
-        <w:rPr>
-          <w:lang w:val="en-US"/>
-        </w:rPr>
-      </w:pPr>
-      <w:r>
-        <w:rPr>
-          <w:lang w:val="en-US"/>
-        </w:rPr>
-        <w:t>}</w:t>
-      </w:r>
-    </w:p>
-    <w:p>
-      <w:pPr>
-        <w:pStyle w:val="Paragrafoelenco"/>
-        <w:rPr>
-          <w:lang w:val="en-US"/>
-        </w:rPr>
-      </w:pPr>
-    </w:p>
-    <w:p>
-      <w:pPr>
-        <w:pStyle w:val="Paragrafoelenco"/>
-        <w:rPr>
-          <w:lang w:val="en-US"/>
-        </w:rPr>
-      </w:pPr>
-      <w:r>
-        <w:rPr>
-          <w:lang w:val="en-US"/>
-        </w:rPr>
-        <w:t>Regole:</w:t>
-      </w:r>
-    </w:p>
-    <w:p>
-      <w:pPr>
-        <w:pStyle w:val="Paragrafoelenco"/>
-        <w:rPr>
-          <w:lang w:val="en-US"/>
-        </w:rPr>
-      </w:pPr>
-      <w:r>
-        <w:rPr>
-          <w:lang w:val="en-US"/>
-        </w:rPr>
-        <w:t>- selected_titlekey e selected_raci_title devono essere null se decision_type è NO_MATCH o MANUAL_REVIEW</w:t>
-      </w:r>
-    </w:p>
-    <w:p>
-      <w:pPr>
-        <w:pStyle w:val="Paragrafoelenco"/>
-        <w:rPr>
-          <w:lang w:val="en-US"/>
-        </w:rPr>
-      </w:pPr>
-      <w:r>
-        <w:rPr>
-          <w:lang w:val="en-US"/>
-        </w:rPr>
-        <w:t>- confidence tra 0 e 1</w:t>
-      </w:r>
-    </w:p>
-    <w:p>
-      <w:pPr>
-        <w:pStyle w:val="Paragrafoelenco"/>
-      </w:pPr>
-      <w:r>
-        <w:t xml:space="preserve">- </w:t>
-      </w:r>
-      <w:proofErr w:type="spellStart"/>
-      <w:r>
-        <w:t>reasoning_summary</w:t>
-      </w:r>
-      <w:proofErr w:type="spellEnd"/>
-      <w:r>
-        <w:t xml:space="preserve"> breve e fattuale</w:t>
-      </w:r>
-    </w:p>
-    <w:p>
-      <w:pPr>
-        <w:pStyle w:val="Paragrafoelenco"/>
-      </w:pPr>
-      <w:r>
-        <w:t xml:space="preserve">- </w:t>
-      </w:r>
-      <w:proofErr w:type="spellStart"/>
-      <w:r>
-        <w:t>resolution_mode</w:t>
-      </w:r>
-      <w:proofErr w:type="spellEnd"/>
-      <w:r>
-        <w:t xml:space="preserve"> deve essere coerente con il conflitto risolto</w:t>
-      </w:r>
-    </w:p>
-    <w:p>
-      <w:pPr>
-        <w:pStyle w:val="Paragrafoelenco"/>
-      </w:pPr>
-    </w:p>
-    <w:p>
-      <w:pPr>
-        <w:pStyle w:val="Paragrafoelenco"/>
-      </w:pPr>
-      <w:r>
-        <w:t xml:space="preserve">Valori attesi di </w:t>
-      </w:r>
-      <w:proofErr w:type="spellStart"/>
-      <w:r>
-        <w:t>resolution_mode</w:t>
-      </w:r>
-      <w:proofErr w:type="spellEnd"/>
-      <w:r>
-        <w:t xml:space="preserve"> lato output Gemini:</w:t>
-      </w:r>
-    </w:p>
-    <w:p>
-      <w:pPr>
-        <w:pStyle w:val="Paragrafoelenco"/>
-        <w:rPr>
-          <w:lang w:val="en-US"/>
-        </w:rPr>
-      </w:pPr>
-      <w:r>
-        <w:rPr>
-          <w:lang w:val="en-US"/>
-        </w:rPr>
-        <w:t>- match_match_conflict_resolved</w:t>
-      </w:r>
-    </w:p>
-    <w:p>
-      <w:pPr>
-        <w:pStyle w:val="Paragrafoelenco"/>
-        <w:rPr>
-          <w:lang w:val="en-US"/>
-        </w:rPr>
-      </w:pPr>
-      <w:r>
-        <w:rPr>
-          <w:lang w:val="en-US"/>
-        </w:rPr>
-        <w:t>- match_no_match_conflict_resolved</w:t>
-      </w:r>
-    </w:p>
-    <w:p>
-      <w:pPr>
-        <w:pStyle w:val="Paragrafoelenco"/>
-      </w:pPr>
-      <w:r>
-        <w:t xml:space="preserve">- </w:t>
-      </w:r>
-      <w:proofErr w:type="spellStart"/>
-      <w:r>
-        <w:t>no_credible_candidate</w:t>
-      </w:r>
-      <w:proofErr w:type="spellEnd"/>
-    </w:p>
-    <w:p>
-      <w:pPr>
-        <w:pStyle w:val="Paragrafoelenco"/>
-      </w:pPr>
-      <w:r>
-        <w:t xml:space="preserve">- </w:t>
-      </w:r>
-      <w:proofErr w:type="spellStart"/>
-      <w:r>
-        <w:t>ambiguous_candidates</w:t>
-      </w:r>
-      <w:proofErr w:type="spellEnd"/>
-    </w:p>
-    <w:p>
-      <w:pPr>
-        <w:pStyle w:val="Paragrafoelenco"/>
-      </w:pPr>
-    </w:p>
-    <w:p>
-      <w:pPr>
-        <w:pStyle w:val="Paragrafoelenco"/>
-      </w:pPr>
-      <w:r>
-        <w:t>==================================================</w:t>
-      </w:r>
-    </w:p>
-    <w:p>
-      <w:pPr>
-        <w:pStyle w:val="Paragrafoelenco"/>
-      </w:pPr>
-      <w:r>
-        <w:t>INPUT ATTESO DAL JUDGE GEMINI</w:t>
-      </w:r>
-    </w:p>
-    <w:p>
-      <w:pPr>
-        <w:pStyle w:val="Paragrafoelenco"/>
-      </w:pPr>
-      <w:r>
-        <w:t>==================================================</w:t>
-      </w:r>
-    </w:p>
-    <w:p>
-      <w:pPr>
-        <w:pStyle w:val="Paragrafoelenco"/>
-      </w:pPr>
-    </w:p>
-    <w:p>
-      <w:pPr>
-        <w:pStyle w:val="Paragrafoelenco"/>
-      </w:pPr>
-      <w:r>
-        <w:t xml:space="preserve">Aggiorna il prompt builder del </w:t>
-      </w:r>
-      <w:proofErr w:type="spellStart"/>
-      <w:r>
-        <w:t>judge</w:t>
-      </w:r>
-      <w:proofErr w:type="spellEnd"/>
-      <w:r>
-        <w:t xml:space="preserve"> in modo che Gemini riceva queste sezioni:</w:t>
-      </w:r>
-    </w:p>
-    <w:p>
-      <w:pPr>
-        <w:pStyle w:val="Paragrafoelenco"/>
-      </w:pPr>
-    </w:p>
-    <w:p>
-      <w:pPr>
-        <w:pStyle w:val="Paragrafoelenco"/>
-      </w:pPr>
-      <w:r>
-        <w:t>1. HISTORICAL MDR RECORD</w:t>
+        <w:t>1. modifica i prompt</w:t>
+      </w:r>
+    </w:p>
+    <w:p>
+      <w:pPr>
+        <w:pStyle w:val="Paragrafoelenco"/>
+      </w:pPr>
+      <w:r>
+        <w:t>2. modifica i builder dei prompt</w:t>
+      </w:r>
+    </w:p>
+    <w:p>
+      <w:pPr>
+        <w:pStyle w:val="Paragrafoelenco"/>
+      </w:pPr>
+      <w:r>
+        <w:t xml:space="preserve">3. modifica schema / parser / </w:t>
+      </w:r>
+      <w:proofErr w:type="spellStart"/>
+      <w:r>
+        <w:t>validator</w:t>
+      </w:r>
+      <w:proofErr w:type="spellEnd"/>
+      <w:r>
+        <w:t xml:space="preserve"> output</w:t>
+      </w:r>
+    </w:p>
+    <w:p>
+      <w:pPr>
+        <w:pStyle w:val="Paragrafoelenco"/>
+      </w:pPr>
+      <w:r>
+        <w:t>4. mostrami i file cambiati</w:t>
+      </w:r>
+    </w:p>
+    <w:p>
+      <w:pPr>
+        <w:pStyle w:val="Paragrafoelenco"/>
+      </w:pPr>
+      <w:r>
+        <w:t>5. spiegami le assunzioni che hai fatto</w:t>
+      </w:r>
+    </w:p>
+    <w:p>
+      <w:pPr>
+        <w:pStyle w:val="Paragrafoelenco"/>
+      </w:pPr>
+      <w:r>
+        <w:t>6. mostrami gli esempi finali di JSON output per:</w:t>
+      </w:r>
+    </w:p>
+    <w:p>
+      <w:pPr>
+        <w:pStyle w:val="Paragrafoelenco"/>
+      </w:pPr>
+      <w:r>
+        <w:t xml:space="preserve">   - agent1_gpt</w:t>
+      </w:r>
+    </w:p>
+    <w:p>
+      <w:pPr>
+        <w:pStyle w:val="Paragrafoelenco"/>
+      </w:pPr>
+      <w:r>
+        <w:t xml:space="preserve">   - agent2_claude</w:t>
       </w:r>
     </w:p>
     <w:p>
@@ -13351,979 +15302,6 @@
       </w:r>
       <w:proofErr w:type="spellStart"/>
       <w:r>
-        <w:t>Document_title</w:t>
-      </w:r>
-      <w:proofErr w:type="spellEnd"/>
-    </w:p>
-    <w:p>
-      <w:pPr>
-        <w:pStyle w:val="Paragrafoelenco"/>
-      </w:pPr>
-      <w:r>
-        <w:t xml:space="preserve">   - </w:t>
-      </w:r>
-      <w:proofErr w:type="spellStart"/>
-      <w:r>
-        <w:t>Discipline_Normalized</w:t>
-      </w:r>
-      <w:proofErr w:type="spellEnd"/>
-    </w:p>
-    <w:p>
-      <w:pPr>
-        <w:pStyle w:val="Paragrafoelenco"/>
-      </w:pPr>
-      <w:r>
-        <w:t xml:space="preserve">   - </w:t>
-      </w:r>
-      <w:proofErr w:type="spellStart"/>
-      <w:r>
-        <w:t>Discipline_Status</w:t>
-      </w:r>
-      <w:proofErr w:type="spellEnd"/>
-    </w:p>
-    <w:p>
-      <w:pPr>
-        <w:pStyle w:val="Paragrafoelenco"/>
-      </w:pPr>
-      <w:r>
-        <w:lastRenderedPageBreak/>
-        <w:t xml:space="preserve">   - Type_L1</w:t>
-      </w:r>
-    </w:p>
-    <w:p>
-      <w:pPr>
-        <w:pStyle w:val="Paragrafoelenco"/>
-      </w:pPr>
-      <w:r>
-        <w:t xml:space="preserve">   - Type_L1_Status</w:t>
-      </w:r>
-    </w:p>
-    <w:p>
-      <w:pPr>
-        <w:pStyle w:val="Paragrafoelenco"/>
-      </w:pPr>
-      <w:r>
-        <w:t xml:space="preserve">   - Type_L2</w:t>
-      </w:r>
-    </w:p>
-    <w:p>
-      <w:pPr>
-        <w:pStyle w:val="Paragrafoelenco"/>
-      </w:pPr>
-      <w:r>
-        <w:t xml:space="preserve">   - Type_L2_Status</w:t>
-      </w:r>
-    </w:p>
-    <w:p>
-      <w:pPr>
-        <w:pStyle w:val="Paragrafoelenco"/>
-      </w:pPr>
-      <w:r>
-        <w:t xml:space="preserve">   - Type_L3</w:t>
-      </w:r>
-    </w:p>
-    <w:p>
-      <w:pPr>
-        <w:pStyle w:val="Paragrafoelenco"/>
-        <w:rPr>
-          <w:lang w:val="en-US"/>
-        </w:rPr>
-      </w:pPr>
-      <w:r>
-        <w:t xml:space="preserve">   </w:t>
-      </w:r>
-      <w:r>
-        <w:rPr>
-          <w:lang w:val="en-US"/>
-        </w:rPr>
-        <w:t>- Type_L3_Status</w:t>
-      </w:r>
-    </w:p>
-    <w:p>
-      <w:pPr>
-        <w:pStyle w:val="Paragrafoelenco"/>
-        <w:rPr>
-          <w:lang w:val="en-US"/>
-        </w:rPr>
-      </w:pPr>
-    </w:p>
-    <w:p>
-      <w:pPr>
-        <w:pStyle w:val="Paragrafoelenco"/>
-        <w:rPr>
-          <w:lang w:val="en-US"/>
-        </w:rPr>
-      </w:pPr>
-      <w:r>
-        <w:rPr>
-          <w:lang w:val="en-US"/>
-        </w:rPr>
-        <w:t>2. DISAGREEMENT TYPE</w:t>
-      </w:r>
-    </w:p>
-    <w:p>
-      <w:pPr>
-        <w:pStyle w:val="Paragrafoelenco"/>
-        <w:rPr>
-          <w:lang w:val="en-US"/>
-        </w:rPr>
-      </w:pPr>
-      <w:r>
-        <w:rPr>
-          <w:lang w:val="en-US"/>
-        </w:rPr>
-        <w:t xml:space="preserve">   - match_match_conflict</w:t>
-      </w:r>
-    </w:p>
-    <w:p>
-      <w:pPr>
-        <w:pStyle w:val="Paragrafoelenco"/>
-        <w:rPr>
-          <w:lang w:val="en-US"/>
-        </w:rPr>
-      </w:pPr>
-      <w:r>
-        <w:rPr>
-          <w:lang w:val="en-US"/>
-        </w:rPr>
-        <w:t xml:space="preserve">   - match_no_match_conflict</w:t>
-      </w:r>
-    </w:p>
-    <w:p>
-      <w:pPr>
-        <w:pStyle w:val="Paragrafoelenco"/>
-        <w:rPr>
-          <w:lang w:val="en-US"/>
-        </w:rPr>
-      </w:pPr>
-    </w:p>
-    <w:p>
-      <w:pPr>
-        <w:pStyle w:val="Paragrafoelenco"/>
-        <w:rPr>
-          <w:lang w:val="en-US"/>
-        </w:rPr>
-      </w:pPr>
-      <w:r>
-        <w:rPr>
-          <w:lang w:val="en-US"/>
-        </w:rPr>
-        <w:t>3. AGENT DECISIONS</w:t>
-      </w:r>
-    </w:p>
-    <w:p>
-      <w:pPr>
-        <w:pStyle w:val="Paragrafoelenco"/>
-        <w:rPr>
-          <w:lang w:val="en-US"/>
-        </w:rPr>
-      </w:pPr>
-      <w:r>
-        <w:rPr>
-          <w:lang w:val="en-US"/>
-        </w:rPr>
-        <w:t xml:space="preserve">   - GPT decision</w:t>
-      </w:r>
-    </w:p>
-    <w:p>
-      <w:pPr>
-        <w:pStyle w:val="Paragrafoelenco"/>
-        <w:rPr>
-          <w:lang w:val="en-US"/>
-        </w:rPr>
-      </w:pPr>
-      <w:r>
-        <w:rPr>
-          <w:lang w:val="en-US"/>
-        </w:rPr>
-        <w:t xml:space="preserve">   - Claude decision</w:t>
-      </w:r>
-    </w:p>
-    <w:p>
-      <w:pPr>
-        <w:pStyle w:val="Paragrafoelenco"/>
-        <w:rPr>
-          <w:lang w:val="en-US"/>
-        </w:rPr>
-      </w:pPr>
-    </w:p>
-    <w:p>
-      <w:pPr>
-        <w:pStyle w:val="Paragrafoelenco"/>
-        <w:rPr>
-          <w:lang w:val="en-US"/>
-        </w:rPr>
-      </w:pPr>
-      <w:r>
-        <w:rPr>
-          <w:lang w:val="en-US"/>
-        </w:rPr>
-        <w:t>4. AGENT TOP CANDIDATES</w:t>
-      </w:r>
-    </w:p>
-    <w:p>
-      <w:pPr>
-        <w:pStyle w:val="Paragrafoelenco"/>
-        <w:rPr>
-          <w:lang w:val="en-US"/>
-        </w:rPr>
-      </w:pPr>
-      <w:r>
-        <w:rPr>
-          <w:lang w:val="en-US"/>
-        </w:rPr>
-        <w:t xml:space="preserve">   - top3 GPT</w:t>
-      </w:r>
-    </w:p>
-    <w:p>
-      <w:pPr>
-        <w:pStyle w:val="Paragrafoelenco"/>
-      </w:pPr>
-      <w:r>
-        <w:rPr>
-          <w:lang w:val="en-US"/>
-        </w:rPr>
-        <w:t xml:space="preserve">   </w:t>
-      </w:r>
-      <w:r>
-        <w:t>- top3 Claude</w:t>
-      </w:r>
-    </w:p>
-    <w:p>
-      <w:pPr>
-        <w:pStyle w:val="Paragrafoelenco"/>
-      </w:pPr>
-    </w:p>
-    <w:p>
-      <w:pPr>
-        <w:pStyle w:val="Paragrafoelenco"/>
-      </w:pPr>
-      <w:r>
-        <w:t>5. FULL TOP50 CANDIDATES</w:t>
-      </w:r>
-    </w:p>
-    <w:p>
-      <w:pPr>
-        <w:pStyle w:val="Paragrafoelenco"/>
-      </w:pPr>
-      <w:r>
-        <w:t xml:space="preserve">   - lista completa dei 50 candidati</w:t>
-      </w:r>
-    </w:p>
-    <w:p>
-      <w:pPr>
-        <w:pStyle w:val="Paragrafoelenco"/>
-      </w:pPr>
-    </w:p>
-    <w:p>
-      <w:pPr>
-        <w:pStyle w:val="Paragrafoelenco"/>
-      </w:pPr>
-      <w:r>
-        <w:t>Il prompt deve rendere esplicito che:</w:t>
-      </w:r>
-    </w:p>
-    <w:p>
-      <w:pPr>
-        <w:pStyle w:val="Paragrafoelenco"/>
-      </w:pPr>
-      <w:r>
-        <w:t>- i top3 agenti sono il focus principale</w:t>
-      </w:r>
-    </w:p>
-    <w:p>
-      <w:pPr>
-        <w:pStyle w:val="Paragrafoelenco"/>
-      </w:pPr>
-      <w:r>
-        <w:t>- i top50 servono per verificare se esiste un candidato migliore sfuggito ai due agenti</w:t>
-      </w:r>
-    </w:p>
-    <w:p>
-      <w:pPr>
-        <w:pStyle w:val="Paragrafoelenco"/>
-      </w:pPr>
-    </w:p>
-    <w:p>
-      <w:pPr>
-        <w:pStyle w:val="Paragrafoelenco"/>
-      </w:pPr>
-      <w:r>
-        <w:t>==================================================</w:t>
-      </w:r>
-    </w:p>
-    <w:p>
-      <w:pPr>
-        <w:pStyle w:val="Paragrafoelenco"/>
-      </w:pPr>
-      <w:r>
-        <w:t>RICHIESTE SUL REFACTOR</w:t>
-      </w:r>
-    </w:p>
-    <w:p>
-      <w:pPr>
-        <w:pStyle w:val="Paragrafoelenco"/>
-      </w:pPr>
-      <w:r>
-        <w:t>==================================================</w:t>
-      </w:r>
-    </w:p>
-    <w:p>
-      <w:pPr>
-        <w:pStyle w:val="Paragrafoelenco"/>
-      </w:pPr>
-    </w:p>
-    <w:p>
-      <w:pPr>
-        <w:pStyle w:val="Paragrafoelenco"/>
-      </w:pPr>
-      <w:r>
-        <w:t>Voglio che tu:</w:t>
-      </w:r>
-    </w:p>
-    <w:p>
-      <w:pPr>
-        <w:pStyle w:val="Paragrafoelenco"/>
-      </w:pPr>
-    </w:p>
-    <w:p>
-      <w:pPr>
-        <w:pStyle w:val="Paragrafoelenco"/>
-      </w:pPr>
-      <w:r>
-        <w:t>1. individui i file che definiscono:</w:t>
-      </w:r>
-    </w:p>
-    <w:p>
-      <w:pPr>
-        <w:pStyle w:val="Paragrafoelenco"/>
-        <w:rPr>
-          <w:lang w:val="en-US"/>
-        </w:rPr>
-      </w:pPr>
-      <w:r>
-        <w:t xml:space="preserve">   </w:t>
-      </w:r>
-      <w:r>
-        <w:rPr>
-          <w:lang w:val="en-US"/>
-        </w:rPr>
-        <w:t>- system prompt GPT</w:t>
-      </w:r>
-    </w:p>
-    <w:p>
-      <w:pPr>
-        <w:pStyle w:val="Paragrafoelenco"/>
-        <w:rPr>
-          <w:lang w:val="en-US"/>
-        </w:rPr>
-      </w:pPr>
-      <w:r>
-        <w:rPr>
-          <w:lang w:val="en-US"/>
-        </w:rPr>
-        <w:t xml:space="preserve">   - system prompt Claude</w:t>
-      </w:r>
-    </w:p>
-    <w:p>
-      <w:pPr>
-        <w:pStyle w:val="Paragrafoelenco"/>
-      </w:pPr>
-      <w:r>
-        <w:rPr>
-          <w:lang w:val="en-US"/>
-        </w:rPr>
-        <w:t xml:space="preserve">   </w:t>
-      </w:r>
-      <w:r>
-        <w:t>- system prompt Gemini</w:t>
-      </w:r>
-    </w:p>
-    <w:p>
-      <w:pPr>
-        <w:pStyle w:val="Paragrafoelenco"/>
-      </w:pPr>
-      <w:r>
-        <w:t xml:space="preserve">   - </w:t>
-      </w:r>
-      <w:proofErr w:type="spellStart"/>
-      <w:r>
-        <w:t>build_user_prompt</w:t>
-      </w:r>
-      <w:proofErr w:type="spellEnd"/>
-      <w:r>
-        <w:t>() dei tre agenti</w:t>
-      </w:r>
-    </w:p>
-    <w:p>
-      <w:pPr>
-        <w:pStyle w:val="Paragrafoelenco"/>
-      </w:pPr>
-      <w:r>
-        <w:t xml:space="preserve">   - parser / </w:t>
-      </w:r>
-      <w:proofErr w:type="spellStart"/>
-      <w:r>
-        <w:t>validator</w:t>
-      </w:r>
-      <w:proofErr w:type="spellEnd"/>
-      <w:r>
-        <w:t xml:space="preserve"> degli output JSON</w:t>
-      </w:r>
-    </w:p>
-    <w:p>
-      <w:pPr>
-        <w:pStyle w:val="Paragrafoelenco"/>
-      </w:pPr>
-      <w:r>
-        <w:t xml:space="preserve">   - eventuali modelli </w:t>
-      </w:r>
-      <w:proofErr w:type="spellStart"/>
-      <w:r>
-        <w:t>typed</w:t>
-      </w:r>
-      <w:proofErr w:type="spellEnd"/>
-      <w:r>
-        <w:t xml:space="preserve"> / </w:t>
-      </w:r>
-      <w:proofErr w:type="spellStart"/>
-      <w:r>
-        <w:t>dataclass</w:t>
-      </w:r>
-      <w:proofErr w:type="spellEnd"/>
-      <w:r>
-        <w:t xml:space="preserve"> / </w:t>
-      </w:r>
-      <w:proofErr w:type="spellStart"/>
-      <w:r>
-        <w:t>pydantic</w:t>
-      </w:r>
-      <w:proofErr w:type="spellEnd"/>
-    </w:p>
-    <w:p>
-      <w:pPr>
-        <w:pStyle w:val="Paragrafoelenco"/>
-      </w:pPr>
-    </w:p>
-    <w:p>
-      <w:pPr>
-        <w:pStyle w:val="Paragrafoelenco"/>
-      </w:pPr>
-      <w:r>
-        <w:t>2. aggiorni i prompt senza cambiare altre parti fuori scope</w:t>
-      </w:r>
-    </w:p>
-    <w:p>
-      <w:pPr>
-        <w:pStyle w:val="Paragrafoelenco"/>
-      </w:pPr>
-    </w:p>
-    <w:p>
-      <w:pPr>
-        <w:pStyle w:val="Paragrafoelenco"/>
-      </w:pPr>
-      <w:r>
-        <w:t>3. aggiorni i modelli dati in modo che supportino:</w:t>
-      </w:r>
-    </w:p>
-    <w:p>
-      <w:pPr>
-        <w:pStyle w:val="Paragrafoelenco"/>
-      </w:pPr>
-      <w:r>
-        <w:t xml:space="preserve">   - </w:t>
-      </w:r>
-      <w:proofErr w:type="spellStart"/>
-      <w:r>
-        <w:t>top_candidates</w:t>
-      </w:r>
-      <w:proofErr w:type="spellEnd"/>
-      <w:r>
-        <w:t xml:space="preserve"> per GPT e Claude</w:t>
-      </w:r>
-    </w:p>
-    <w:p>
-      <w:pPr>
-        <w:pStyle w:val="Paragrafoelenco"/>
-      </w:pPr>
-      <w:r>
-        <w:t xml:space="preserve">   - </w:t>
-      </w:r>
-      <w:proofErr w:type="spellStart"/>
-      <w:r>
-        <w:t>resolution_mode</w:t>
-      </w:r>
-      <w:proofErr w:type="spellEnd"/>
-      <w:r>
-        <w:t xml:space="preserve"> per Gemini</w:t>
-      </w:r>
-    </w:p>
-    <w:p>
-      <w:pPr>
-        <w:pStyle w:val="Paragrafoelenco"/>
-      </w:pPr>
-    </w:p>
-    <w:p>
-      <w:pPr>
-        <w:pStyle w:val="Paragrafoelenco"/>
-      </w:pPr>
-      <w:r>
-        <w:t xml:space="preserve">4. aggiorni eventuali parser JSON o </w:t>
-      </w:r>
-      <w:proofErr w:type="spellStart"/>
-      <w:r>
-        <w:t>validator</w:t>
-      </w:r>
-      <w:proofErr w:type="spellEnd"/>
-    </w:p>
-    <w:p>
-      <w:pPr>
-        <w:pStyle w:val="Paragrafoelenco"/>
-      </w:pPr>
-    </w:p>
-    <w:p>
-      <w:pPr>
-        <w:pStyle w:val="Paragrafoelenco"/>
-      </w:pPr>
-      <w:r>
-        <w:t>5. aggiorni eventuali test esistenti</w:t>
-      </w:r>
-    </w:p>
-    <w:p>
-      <w:pPr>
-        <w:pStyle w:val="Paragrafoelenco"/>
-      </w:pPr>
-    </w:p>
-    <w:p>
-      <w:pPr>
-        <w:pStyle w:val="Paragrafoelenco"/>
-      </w:pPr>
-      <w:r>
-        <w:t>==================================================</w:t>
-      </w:r>
-    </w:p>
-    <w:p>
-      <w:pPr>
-        <w:pStyle w:val="Paragrafoelenco"/>
-      </w:pPr>
-      <w:r>
-        <w:t>RICHIESTE IMPORTANTI</w:t>
-      </w:r>
-    </w:p>
-    <w:p>
-      <w:pPr>
-        <w:pStyle w:val="Paragrafoelenco"/>
-      </w:pPr>
-      <w:r>
-        <w:t>==================================================</w:t>
-      </w:r>
-    </w:p>
-    <w:p>
-      <w:pPr>
-        <w:pStyle w:val="Paragrafoelenco"/>
-      </w:pPr>
-    </w:p>
-    <w:p>
-      <w:pPr>
-        <w:pStyle w:val="Paragrafoelenco"/>
-      </w:pPr>
-      <w:r>
-        <w:t xml:space="preserve">- non cambiare la logica DB o lo script </w:t>
-      </w:r>
-      <w:proofErr w:type="spellStart"/>
-      <w:r>
-        <w:t>judge</w:t>
-      </w:r>
-      <w:proofErr w:type="spellEnd"/>
-      <w:r>
-        <w:t xml:space="preserve"> qui, salvo il minimo necessario per supportare i nuovi schema output</w:t>
-      </w:r>
-    </w:p>
-    <w:p>
-      <w:pPr>
-        <w:pStyle w:val="Paragrafoelenco"/>
-      </w:pPr>
-      <w:r>
-        <w:t>- non introdurre campi non richiesti</w:t>
-      </w:r>
-    </w:p>
-    <w:p>
-      <w:pPr>
-        <w:pStyle w:val="Paragrafoelenco"/>
-      </w:pPr>
-      <w:r>
-        <w:t>- non cambiare nomi di file o funzioni inutilmente</w:t>
-      </w:r>
-    </w:p>
-    <w:p>
-      <w:pPr>
-        <w:pStyle w:val="Paragrafoelenco"/>
-      </w:pPr>
-      <w:r>
-        <w:t>- mantieni il codice coerente con l’architettura attuale</w:t>
-      </w:r>
-    </w:p>
-    <w:p>
-      <w:pPr>
-        <w:pStyle w:val="Paragrafoelenco"/>
-      </w:pPr>
-      <w:r>
-        <w:t xml:space="preserve">- se esistono output schema </w:t>
-      </w:r>
-      <w:proofErr w:type="spellStart"/>
-      <w:r>
-        <w:t>hardcoded</w:t>
-      </w:r>
-      <w:proofErr w:type="spellEnd"/>
-      <w:r>
-        <w:t>, aggiornali</w:t>
-      </w:r>
-    </w:p>
-    <w:p>
-      <w:pPr>
-        <w:pStyle w:val="Paragrafoelenco"/>
-      </w:pPr>
-      <w:r>
-        <w:t>- se ci sono prompt duplicati o molto simili tra GPT e Claude, riusa il più possibile senza rompere il codice</w:t>
-      </w:r>
-    </w:p>
-    <w:p>
-      <w:pPr>
-        <w:pStyle w:val="Paragrafoelenco"/>
-      </w:pPr>
-      <w:r>
-        <w:t xml:space="preserve">- se serve, estrai </w:t>
-      </w:r>
-      <w:proofErr w:type="spellStart"/>
-      <w:r>
-        <w:t>helper</w:t>
-      </w:r>
-      <w:proofErr w:type="spellEnd"/>
-      <w:r>
-        <w:t xml:space="preserve"> comuni per il rendering di </w:t>
-      </w:r>
-      <w:proofErr w:type="spellStart"/>
-      <w:r>
-        <w:t>top_candidates</w:t>
-      </w:r>
-      <w:proofErr w:type="spellEnd"/>
-    </w:p>
-    <w:p>
-      <w:pPr>
-        <w:pStyle w:val="Paragrafoelenco"/>
-      </w:pPr>
-    </w:p>
-    <w:p>
-      <w:pPr>
-        <w:pStyle w:val="Paragrafoelenco"/>
-      </w:pPr>
-      <w:r>
-        <w:t>==================================================</w:t>
-      </w:r>
-    </w:p>
-    <w:p>
-      <w:pPr>
-        <w:pStyle w:val="Paragrafoelenco"/>
-      </w:pPr>
-      <w:r>
-        <w:t>CASI DI TEST DA COPRIRE</w:t>
-      </w:r>
-    </w:p>
-    <w:p>
-      <w:pPr>
-        <w:pStyle w:val="Paragrafoelenco"/>
-      </w:pPr>
-      <w:r>
-        <w:t>==================================================</w:t>
-      </w:r>
-    </w:p>
-    <w:p>
-      <w:pPr>
-        <w:pStyle w:val="Paragrafoelenco"/>
-      </w:pPr>
-    </w:p>
-    <w:p>
-      <w:pPr>
-        <w:pStyle w:val="Paragrafoelenco"/>
-      </w:pPr>
-      <w:r>
-        <w:t>Voglio almeno questi casi:</w:t>
-      </w:r>
-    </w:p>
-    <w:p>
-      <w:pPr>
-        <w:pStyle w:val="Paragrafoelenco"/>
-      </w:pPr>
-    </w:p>
-    <w:p>
-      <w:pPr>
-        <w:pStyle w:val="Paragrafoelenco"/>
-      </w:pPr>
-      <w:r>
-        <w:t>AGENT GPT/CLAUDE</w:t>
-      </w:r>
-    </w:p>
-    <w:p>
-      <w:pPr>
-        <w:pStyle w:val="Paragrafoelenco"/>
-        <w:rPr>
-          <w:lang w:val="en-US"/>
-        </w:rPr>
-      </w:pPr>
-      <w:r>
-        <w:rPr>
-          <w:lang w:val="en-US"/>
-        </w:rPr>
-        <w:t>1. MATCH con top_candidates[0] uguale a selected_titlekey</w:t>
-      </w:r>
-    </w:p>
-    <w:p>
-      <w:pPr>
-        <w:pStyle w:val="Paragrafoelenco"/>
-        <w:rPr>
-          <w:lang w:val="en-US"/>
-        </w:rPr>
-      </w:pPr>
-      <w:r>
-        <w:rPr>
-          <w:lang w:val="en-US"/>
-        </w:rPr>
-        <w:t>2. NO_MATCH con top_candidates vuoto</w:t>
-      </w:r>
-    </w:p>
-    <w:p>
-      <w:pPr>
-        <w:pStyle w:val="Paragrafoelenco"/>
-      </w:pPr>
-      <w:r>
-        <w:t xml:space="preserve">3. NO_MATCH con </w:t>
-      </w:r>
-      <w:proofErr w:type="spellStart"/>
-      <w:r>
-        <w:t>top_candidates</w:t>
-      </w:r>
-      <w:proofErr w:type="spellEnd"/>
-      <w:r>
-        <w:t xml:space="preserve"> presenti ma insufficienti</w:t>
-      </w:r>
-    </w:p>
-    <w:p>
-      <w:pPr>
-        <w:pStyle w:val="Paragrafoelenco"/>
-      </w:pPr>
-      <w:r>
-        <w:t xml:space="preserve">4. </w:t>
-      </w:r>
-      <w:proofErr w:type="spellStart"/>
-      <w:r>
-        <w:t>invalid</w:t>
-      </w:r>
-      <w:proofErr w:type="spellEnd"/>
-      <w:r>
-        <w:t xml:space="preserve"> output se </w:t>
-      </w:r>
-      <w:proofErr w:type="spellStart"/>
-      <w:r>
-        <w:t>rank</w:t>
-      </w:r>
-      <w:proofErr w:type="spellEnd"/>
-      <w:r>
-        <w:t xml:space="preserve"> non parte da 1 o se ci sono duplicati</w:t>
-      </w:r>
-    </w:p>
-    <w:p>
-      <w:pPr>
-        <w:pStyle w:val="Paragrafoelenco"/>
-      </w:pPr>
-    </w:p>
-    <w:p>
-      <w:pPr>
-        <w:pStyle w:val="Paragrafoelenco"/>
-        <w:rPr>
-          <w:lang w:val="en-US"/>
-        </w:rPr>
-      </w:pPr>
-      <w:r>
-        <w:rPr>
-          <w:lang w:val="en-US"/>
-        </w:rPr>
-        <w:t>JUDGE GEMINI</w:t>
-      </w:r>
-    </w:p>
-    <w:p>
-      <w:pPr>
-        <w:pStyle w:val="Paragrafoelenco"/>
-        <w:rPr>
-          <w:lang w:val="en-US"/>
-        </w:rPr>
-      </w:pPr>
-      <w:r>
-        <w:rPr>
-          <w:lang w:val="en-US"/>
-        </w:rPr>
-        <w:t>5. conflict MATCH vs MATCH</w:t>
-      </w:r>
-    </w:p>
-    <w:p>
-      <w:pPr>
-        <w:pStyle w:val="Paragrafoelenco"/>
-        <w:rPr>
-          <w:lang w:val="en-US"/>
-        </w:rPr>
-      </w:pPr>
-      <w:r>
-        <w:rPr>
-          <w:lang w:val="en-US"/>
-        </w:rPr>
-        <w:t>6. conflict MATCH vs NO_MATCH</w:t>
-      </w:r>
-    </w:p>
-    <w:p>
-      <w:pPr>
-        <w:pStyle w:val="Paragrafoelenco"/>
-        <w:rPr>
-          <w:lang w:val="en-US"/>
-        </w:rPr>
-      </w:pPr>
-      <w:r>
-        <w:rPr>
-          <w:lang w:val="en-US"/>
-        </w:rPr>
-        <w:t>7. valid output NO_MATCH con selected_titlekey = null</w:t>
-      </w:r>
-    </w:p>
-    <w:p>
-      <w:pPr>
-        <w:pStyle w:val="Paragrafoelenco"/>
-        <w:rPr>
-          <w:lang w:val="en-US"/>
-        </w:rPr>
-      </w:pPr>
-      <w:r>
-        <w:rPr>
-          <w:lang w:val="en-US"/>
-        </w:rPr>
-        <w:t>8. valid output MANUAL_REVIEW con selected_titlekey = null</w:t>
-      </w:r>
-    </w:p>
-    <w:p>
-      <w:pPr>
-        <w:pStyle w:val="Paragrafoelenco"/>
-        <w:rPr>
-          <w:lang w:val="en-US"/>
-        </w:rPr>
-      </w:pPr>
-    </w:p>
-    <w:p>
-      <w:pPr>
-        <w:pStyle w:val="Paragrafoelenco"/>
-      </w:pPr>
-      <w:r>
-        <w:t>==================================================</w:t>
-      </w:r>
-    </w:p>
-    <w:p>
-      <w:pPr>
-        <w:pStyle w:val="Paragrafoelenco"/>
-      </w:pPr>
-      <w:r>
-        <w:t>OUTPUT ATTESO DA TE</w:t>
-      </w:r>
-    </w:p>
-    <w:p>
-      <w:pPr>
-        <w:pStyle w:val="Paragrafoelenco"/>
-      </w:pPr>
-      <w:r>
-        <w:t>==================================================</w:t>
-      </w:r>
-    </w:p>
-    <w:p>
-      <w:pPr>
-        <w:pStyle w:val="Paragrafoelenco"/>
-      </w:pPr>
-    </w:p>
-    <w:p>
-      <w:pPr>
-        <w:pStyle w:val="Paragrafoelenco"/>
-      </w:pPr>
-      <w:r>
-        <w:t>1. modifica i prompt</w:t>
-      </w:r>
-    </w:p>
-    <w:p>
-      <w:pPr>
-        <w:pStyle w:val="Paragrafoelenco"/>
-      </w:pPr>
-      <w:r>
-        <w:t>2. modifica i builder dei prompt</w:t>
-      </w:r>
-    </w:p>
-    <w:p>
-      <w:pPr>
-        <w:pStyle w:val="Paragrafoelenco"/>
-      </w:pPr>
-      <w:r>
-        <w:t xml:space="preserve">3. modifica schema / parser / </w:t>
-      </w:r>
-      <w:proofErr w:type="spellStart"/>
-      <w:r>
-        <w:t>validator</w:t>
-      </w:r>
-      <w:proofErr w:type="spellEnd"/>
-      <w:r>
-        <w:t xml:space="preserve"> output</w:t>
-      </w:r>
-    </w:p>
-    <w:p>
-      <w:pPr>
-        <w:pStyle w:val="Paragrafoelenco"/>
-      </w:pPr>
-      <w:r>
-        <w:t>4. mostrami i file cambiati</w:t>
-      </w:r>
-    </w:p>
-    <w:p>
-      <w:pPr>
-        <w:pStyle w:val="Paragrafoelenco"/>
-      </w:pPr>
-      <w:r>
-        <w:t>5. spiegami le assunzioni che hai fatto</w:t>
-      </w:r>
-    </w:p>
-    <w:p>
-      <w:pPr>
-        <w:pStyle w:val="Paragrafoelenco"/>
-      </w:pPr>
-      <w:r>
-        <w:t>6. mostrami gli esempi finali di JSON output per:</w:t>
-      </w:r>
-    </w:p>
-    <w:p>
-      <w:pPr>
-        <w:pStyle w:val="Paragrafoelenco"/>
-      </w:pPr>
-      <w:r>
-        <w:t xml:space="preserve">   - agent1_gpt</w:t>
-      </w:r>
-    </w:p>
-    <w:p>
-      <w:pPr>
-        <w:pStyle w:val="Paragrafoelenco"/>
-      </w:pPr>
-      <w:r>
-        <w:t xml:space="preserve">   - agent2_claude</w:t>
-      </w:r>
-    </w:p>
-    <w:p>
-      <w:pPr>
-        <w:pStyle w:val="Paragrafoelenco"/>
-      </w:pPr>
-      <w:r>
-        <w:t xml:space="preserve">   - </w:t>
-      </w:r>
-      <w:proofErr w:type="spellStart"/>
-      <w:r>
         <w:t>judge_gemini</w:t>
       </w:r>
       <w:proofErr w:type="spellEnd"/>
@@ -14336,6 +15314,7 @@
     <w:p>
       <w:pPr>
         <w:pStyle w:val="Paragrafoelenco"/>
+        <w:jc w:val="both"/>
       </w:pPr>
       <w:r>
         <w:t>Prima analizza i file esistenti e poi applica modifiche mirate.</w:t>
@@ -17293,4 +18272,16 @@
     </a:ext>
   </a:extLst>
 </a:theme>
+</file>
+
+<file path=customXml/item1.xml><?xml version="1.0" encoding="utf-8"?>
+<b:Sources xmlns:b="http://schemas.openxmlformats.org/officeDocument/2006/bibliography" xmlns="http://schemas.openxmlformats.org/officeDocument/2006/bibliography" SelectedStyle="\APASixthEditionOfficeOnline.xsl" StyleName="APA" Version="6"/>
+</file>
+
+<file path=customXml/itemProps1.xml><?xml version="1.0" encoding="utf-8"?>
+<ds:datastoreItem xmlns:ds="http://schemas.openxmlformats.org/officeDocument/2006/customXml" ds:itemID="{CC8B3586-1B32-4033-8F74-8F33D139A213}">
+  <ds:schemaRefs>
+    <ds:schemaRef ds:uri="http://schemas.openxmlformats.org/officeDocument/2006/bibliography"/>
+  </ds:schemaRefs>
+</ds:datastoreItem>
 </file>
</xml_diff>